<commit_message>
Simple map: zone names editable on the Stock sheet
Each zone name lives in one pink-bordered cell on Stock; aisle labels,
the map legend and free-space counts all read from it by formula.

Co-Authored-By: Claude Opus 5.5 <noreply@anthropic.com>
Claude-Session: https://claude.ai/code/session_01PaVB5ZWiX4HH2k96Bt3cJ6
</commit_message>
<xml_diff>
--- a/Floor_Map_Simple_Guide.docx
+++ b/Floor_Map_Simple_Guide.docx
@@ -61,9 +61,9 @@
             </w:tcBorders>
             <w:shd w:fill="F5F5F5" w:color="auto" w:val="clear"/>
             <w:tcMar>
-              <w:top w:type="dxa" w:w="140"/>
+              <w:top w:type="dxa" w:w="100"/>
               <w:left w:type="dxa" w:w="260"/>
-              <w:bottom w:type="dxa" w:w="120"/>
+              <w:bottom w:type="dxa" w:w="80"/>
               <w:right w:type="dxa" w:w="200"/>
             </w:tcMar>
           </w:tcPr>
@@ -196,7 +196,7 @@
     </w:tbl>
     <w:p>
       <w:pPr>
-        <w:spacing w:after="180"/>
+        <w:spacing w:after="90"/>
       </w:pPr>
     </w:p>
     <w:tbl>
@@ -226,9 +226,9 @@
             </w:tcBorders>
             <w:shd w:fill="F5F5F5" w:color="auto" w:val="clear"/>
             <w:tcMar>
-              <w:top w:type="dxa" w:w="140"/>
+              <w:top w:type="dxa" w:w="100"/>
               <w:left w:type="dxa" w:w="260"/>
-              <w:bottom w:type="dxa" w:w="120"/>
+              <w:bottom w:type="dxa" w:w="80"/>
               <w:right w:type="dxa" w:w="200"/>
             </w:tcMar>
           </w:tcPr>
@@ -319,7 +319,7 @@
     </w:tbl>
     <w:p>
       <w:pPr>
-        <w:spacing w:after="180"/>
+        <w:spacing w:after="90"/>
       </w:pPr>
     </w:p>
     <w:tbl>
@@ -349,9 +349,9 @@
             </w:tcBorders>
             <w:shd w:fill="F5F5F5" w:color="auto" w:val="clear"/>
             <w:tcMar>
-              <w:top w:type="dxa" w:w="140"/>
+              <w:top w:type="dxa" w:w="100"/>
               <w:left w:type="dxa" w:w="260"/>
-              <w:bottom w:type="dxa" w:w="120"/>
+              <w:bottom w:type="dxa" w:w="80"/>
               <w:right w:type="dxa" w:w="200"/>
             </w:tcMar>
           </w:tcPr>
@@ -460,7 +460,7 @@
     </w:tbl>
     <w:p>
       <w:pPr>
-        <w:spacing w:after="180"/>
+        <w:spacing w:after="90"/>
       </w:pPr>
     </w:p>
     <w:tbl>
@@ -490,9 +490,9 @@
             </w:tcBorders>
             <w:shd w:fill="F5F5F5" w:color="auto" w:val="clear"/>
             <w:tcMar>
-              <w:top w:type="dxa" w:w="140"/>
+              <w:top w:type="dxa" w:w="100"/>
               <w:left w:type="dxa" w:w="260"/>
-              <w:bottom w:type="dxa" w:w="120"/>
+              <w:bottom w:type="dxa" w:w="80"/>
               <w:right w:type="dxa" w:w="200"/>
             </w:tcMar>
           </w:tcPr>
@@ -661,7 +661,172 @@
     </w:tbl>
     <w:p>
       <w:pPr>
-        <w:spacing w:after="260"/>
+        <w:spacing w:after="90"/>
+      </w:pPr>
+    </w:p>
+    <w:tbl>
+      <w:tblPr>
+        <w:tblW w:type="dxa" w:w="9638"/>
+        <w:tblBorders>
+          <w:top w:val="single" w:color="auto" w:sz="4"/>
+          <w:left w:val="single" w:color="auto" w:sz="4"/>
+          <w:bottom w:val="single" w:color="auto" w:sz="4"/>
+          <w:right w:val="single" w:color="auto" w:sz="4"/>
+          <w:insideH w:val="single" w:color="auto" w:sz="4"/>
+          <w:insideV w:val="single" w:color="auto" w:sz="4"/>
+        </w:tblBorders>
+      </w:tblPr>
+      <w:tblGrid>
+        <w:gridCol w:w="9638"/>
+      </w:tblGrid>
+      <w:tr>
+        <w:tc>
+          <w:tcPr>
+            <w:tcW w:type="dxa" w:w="9638"/>
+            <w:tcBorders>
+              <w:top w:val="none" w:color="FFFFFF" w:sz="0"/>
+              <w:left w:val="single" w:color="404040" w:sz="48"/>
+              <w:bottom w:val="none" w:color="FFFFFF" w:sz="0"/>
+              <w:right w:val="none" w:color="FFFFFF" w:sz="0"/>
+            </w:tcBorders>
+            <w:shd w:fill="F5F5F5" w:color="auto" w:val="clear"/>
+            <w:tcMar>
+              <w:top w:type="dxa" w:w="100"/>
+              <w:left w:type="dxa" w:w="260"/>
+              <w:bottom w:type="dxa" w:w="80"/>
+              <w:right w:type="dxa" w:w="200"/>
+            </w:tcMar>
+          </w:tcPr>
+          <w:p>
+            <w:pPr>
+              <w:spacing w:after="100"/>
+            </w:pPr>
+            <w:r>
+              <w:rPr>
+                <w:rFonts w:ascii="Arial" w:cs="Arial" w:eastAsia="Arial" w:hAnsi="Arial"/>
+                <w:b/>
+                <w:bCs/>
+                <w:color w:val="404040"/>
+                <w:sz w:val="32"/>
+                <w:szCs w:val="32"/>
+              </w:rPr>
+              <w:t xml:space="preserve">CHANGE A ZONE NAME?</w:t>
+            </w:r>
+          </w:p>
+          <w:p>
+            <w:pPr>
+              <w:spacing w:after="70"/>
+            </w:pPr>
+            <w:r>
+              <w:rPr>
+                <w:rFonts w:ascii="Arial" w:cs="Arial" w:eastAsia="Arial" w:hAnsi="Arial"/>
+                <w:b/>
+                <w:bCs/>
+                <w:color w:val="404040"/>
+                <w:sz w:val="26"/>
+                <w:szCs w:val="26"/>
+              </w:rPr>
+              <w:t xml:space="preserve">1.  </w:t>
+            </w:r>
+            <w:r>
+              <w:rPr>
+                <w:rFonts w:ascii="Arial" w:cs="Arial" w:eastAsia="Arial" w:hAnsi="Arial"/>
+                <w:sz w:val="26"/>
+                <w:szCs w:val="26"/>
+              </w:rPr>
+              <w:t xml:space="preserve">Go to the </w:t>
+            </w:r>
+            <w:r>
+              <w:rPr>
+                <w:rFonts w:ascii="Arial" w:cs="Arial" w:eastAsia="Arial" w:hAnsi="Arial"/>
+                <w:b/>
+                <w:bCs/>
+                <w:sz w:val="26"/>
+                <w:szCs w:val="26"/>
+              </w:rPr>
+              <w:t xml:space="preserve">Stock</w:t>
+            </w:r>
+            <w:r>
+              <w:rPr>
+                <w:rFonts w:ascii="Arial" w:cs="Arial" w:eastAsia="Arial" w:hAnsi="Arial"/>
+                <w:sz w:val="26"/>
+                <w:szCs w:val="26"/>
+              </w:rPr>
+              <w:t xml:space="preserve"> sheet.</w:t>
+            </w:r>
+          </w:p>
+          <w:p>
+            <w:pPr>
+              <w:spacing w:after="70"/>
+            </w:pPr>
+            <w:r>
+              <w:rPr>
+                <w:rFonts w:ascii="Arial" w:cs="Arial" w:eastAsia="Arial" w:hAnsi="Arial"/>
+                <w:b/>
+                <w:bCs/>
+                <w:color w:val="404040"/>
+                <w:sz w:val="26"/>
+                <w:szCs w:val="26"/>
+              </w:rPr>
+              <w:t xml:space="preserve">2.  </w:t>
+            </w:r>
+            <w:r>
+              <w:rPr>
+                <w:rFonts w:ascii="Arial" w:cs="Arial" w:eastAsia="Arial" w:hAnsi="Arial"/>
+                <w:sz w:val="26"/>
+                <w:szCs w:val="26"/>
+              </w:rPr>
+              <w:t xml:space="preserve">Type over the name in the </w:t>
+            </w:r>
+            <w:r>
+              <w:rPr>
+                <w:rFonts w:ascii="Arial" w:cs="Arial" w:eastAsia="Arial" w:hAnsi="Arial"/>
+                <w:b/>
+                <w:bCs/>
+                <w:sz w:val="26"/>
+                <w:szCs w:val="26"/>
+              </w:rPr>
+              <w:t xml:space="preserve">pink box</w:t>
+            </w:r>
+            <w:r>
+              <w:rPr>
+                <w:rFonts w:ascii="Arial" w:cs="Arial" w:eastAsia="Arial" w:hAnsi="Arial"/>
+                <w:sz w:val="26"/>
+                <w:szCs w:val="26"/>
+              </w:rPr>
+              <w:t xml:space="preserve"> on the right.</w:t>
+            </w:r>
+          </w:p>
+          <w:p>
+            <w:pPr>
+              <w:spacing w:after="70"/>
+            </w:pPr>
+            <w:r>
+              <w:rPr>
+                <w:rFonts w:ascii="Arial" w:cs="Arial" w:eastAsia="Arial" w:hAnsi="Arial"/>
+                <w:b/>
+                <w:bCs/>
+                <w:color w:val="404040"/>
+                <w:sz w:val="26"/>
+                <w:szCs w:val="26"/>
+              </w:rPr>
+              <w:t xml:space="preserve">3.  </w:t>
+            </w:r>
+            <w:r>
+              <w:rPr>
+                <w:rFonts w:ascii="Arial" w:cs="Arial" w:eastAsia="Arial" w:hAnsi="Arial"/>
+                <w:sz w:val="26"/>
+                <w:szCs w:val="26"/>
+              </w:rPr>
+              <w:t xml:space="preserve">The Map changes by itself.</w:t>
+            </w:r>
+          </w:p>
+        </w:tc>
+      </w:tr>
+    </w:tbl>
+    <w:p>
+      <w:pPr>
+        <w:spacing w:after="160"/>
       </w:pPr>
     </w:p>
     <w:p>
@@ -1011,7 +1176,7 @@
     </w:tbl>
     <w:p>
       <w:pPr>
-        <w:spacing w:after="200"/>
+        <w:spacing w:after="140"/>
       </w:pPr>
     </w:p>
     <w:p>
@@ -1039,7 +1204,7 @@
     </w:p>
     <w:sectPr>
       <w:pgSz w:w="11906" w:h="16838" w:orient="portrait"/>
-      <w:pgMar w:top="1000" w:right="1134" w:bottom="900" w:left="1134" w:header="708" w:footer="708" w:gutter="0"/>
+      <w:pgMar w:top="800" w:right="1134" w:bottom="700" w:left="1134" w:header="708" w:footer="708" w:gutter="0"/>
       <w:pgNumType/>
       <w:docGrid w:linePitch="360"/>
     </w:sectPr>

</xml_diff>

<commit_message>
Simple map: add optional VBA (one paste into the Map sheet)
Double-click to pick up and move/swap pallets or put away from a
numbered list; buttons for Find space, Find item, Low stock, Undo and
Clear; every change logged to a new Moves sheet. Builder adds the
Moves sheet, a hidden Squares sheet the macros read, and a button row.

Co-Authored-By: Claude Opus 5.5 <noreply@anthropic.com>
Claude-Session: https://claude.ai/code/session_01PaVB5ZWiX4HH2k96Bt3cJ6
</commit_message>
<xml_diff>
--- a/Floor_Map_Simple_Guide.docx
+++ b/Floor_Map_Simple_Guide.docx
@@ -31,7 +31,7 @@
           <w:sz w:val="26"/>
           <w:szCs w:val="26"/>
         </w:rPr>
-        <w:t xml:space="preserve">Open Floor_Map_Simple.xlsx. No macros, nothing to set up. Everything is counted in pallets.</w:t>
+        <w:t xml:space="preserve">Open Floor_Map_Simple.xlsm. Everything is counted in pallets.</w:t>
       </w:r>
     </w:p>
     <w:tbl>
@@ -101,28 +101,20 @@
             <w:r>
               <w:rPr>
                 <w:rFonts w:ascii="Arial" w:cs="Arial" w:eastAsia="Arial" w:hAnsi="Arial"/>
-                <w:sz w:val="26"/>
-                <w:szCs w:val="26"/>
-              </w:rPr>
-              <w:t xml:space="preserve">Click a square on the </w:t>
-            </w:r>
-            <w:r>
-              <w:rPr>
-                <w:rFonts w:ascii="Arial" w:cs="Arial" w:eastAsia="Arial" w:hAnsi="Arial"/>
-                <w:b/>
-                <w:bCs/>
-                <w:sz w:val="26"/>
-                <w:szCs w:val="26"/>
-              </w:rPr>
-              <w:t xml:space="preserve">Map</w:t>
-            </w:r>
-            <w:r>
-              <w:rPr>
-                <w:rFonts w:ascii="Arial" w:cs="Arial" w:eastAsia="Arial" w:hAnsi="Arial"/>
-                <w:sz w:val="26"/>
-                <w:szCs w:val="26"/>
-              </w:rPr>
-              <w:t xml:space="preserve">.</w:t>
+                <w:b/>
+                <w:bCs/>
+                <w:sz w:val="26"/>
+                <w:szCs w:val="26"/>
+              </w:rPr>
+              <w:t xml:space="preserve">Double-click</w:t>
+            </w:r>
+            <w:r>
+              <w:rPr>
+                <w:rFonts w:ascii="Arial" w:cs="Arial" w:eastAsia="Arial" w:hAnsi="Arial"/>
+                <w:sz w:val="26"/>
+                <w:szCs w:val="26"/>
+              </w:rPr>
+              <w:t xml:space="preserve"> an empty square.</w:t>
             </w:r>
           </w:p>
           <w:p>
@@ -146,7 +138,49 @@
                 <w:sz w:val="26"/>
                 <w:szCs w:val="26"/>
               </w:rPr>
-              <w:t xml:space="preserve">Click the </w:t>
+              <w:t xml:space="preserve">Type the </w:t>
+            </w:r>
+            <w:r>
+              <w:rPr>
+                <w:rFonts w:ascii="Arial" w:cs="Arial" w:eastAsia="Arial" w:hAnsi="Arial"/>
+                <w:b/>
+                <w:bCs/>
+                <w:sz w:val="26"/>
+                <w:szCs w:val="26"/>
+              </w:rPr>
+              <w:t xml:space="preserve">number</w:t>
+            </w:r>
+            <w:r>
+              <w:rPr>
+                <w:rFonts w:ascii="Arial" w:cs="Arial" w:eastAsia="Arial" w:hAnsi="Arial"/>
+                <w:sz w:val="26"/>
+                <w:szCs w:val="26"/>
+              </w:rPr>
+              <w:t xml:space="preserve"> of the item and press Enter.</w:t>
+            </w:r>
+          </w:p>
+          <w:p>
+            <w:pPr>
+              <w:spacing w:after="70"/>
+            </w:pPr>
+            <w:r>
+              <w:rPr>
+                <w:rFonts w:ascii="Arial" w:cs="Arial" w:eastAsia="Arial" w:hAnsi="Arial"/>
+                <w:b/>
+                <w:bCs/>
+                <w:color w:val="00843D"/>
+                <w:sz w:val="26"/>
+                <w:szCs w:val="26"/>
+              </w:rPr>
+              <w:t xml:space="preserve">3.  </w:t>
+            </w:r>
+            <w:r>
+              <w:rPr>
+                <w:rFonts w:ascii="Arial" w:cs="Arial" w:eastAsia="Arial" w:hAnsi="Arial"/>
+                <w:sz w:val="26"/>
+                <w:szCs w:val="26"/>
+              </w:rPr>
+              <w:t xml:space="preserve">(Or click the square, click the </w:t>
             </w:r>
             <w:r>
               <w:rPr>
@@ -164,31 +198,7 @@
                 <w:sz w:val="26"/>
                 <w:szCs w:val="26"/>
               </w:rPr>
-              <w:t xml:space="preserve"> next to it.</w:t>
-            </w:r>
-          </w:p>
-          <w:p>
-            <w:pPr>
-              <w:spacing w:after="70"/>
-            </w:pPr>
-            <w:r>
-              <w:rPr>
-                <w:rFonts w:ascii="Arial" w:cs="Arial" w:eastAsia="Arial" w:hAnsi="Arial"/>
-                <w:b/>
-                <w:bCs/>
-                <w:color w:val="00843D"/>
-                <w:sz w:val="26"/>
-                <w:szCs w:val="26"/>
-              </w:rPr>
-              <w:t xml:space="preserve">3.  </w:t>
-            </w:r>
-            <w:r>
-              <w:rPr>
-                <w:rFonts w:ascii="Arial" w:cs="Arial" w:eastAsia="Arial" w:hAnsi="Arial"/>
-                <w:sz w:val="26"/>
-                <w:szCs w:val="26"/>
-              </w:rPr>
-              <w:t xml:space="preserve">Pick the item. The square fills with colour.</w:t>
+              <w:t xml:space="preserve">, and pick.)</w:t>
             </w:r>
           </w:p>
         </w:tc>
@@ -220,7 +230,7 @@
             <w:tcW w:type="dxa" w:w="9638"/>
             <w:tcBorders>
               <w:top w:val="none" w:color="FFFFFF" w:sz="0"/>
-              <w:left w:val="single" w:color="C00000" w:sz="48"/>
+              <w:left w:val="single" w:color="0070C0" w:sz="48"/>
               <w:bottom w:val="none" w:color="FFFFFF" w:sz="0"/>
               <w:right w:val="none" w:color="FFFFFF" w:sz="0"/>
             </w:tcBorders>
@@ -241,11 +251,11 @@
                 <w:rFonts w:ascii="Arial" w:cs="Arial" w:eastAsia="Arial" w:hAnsi="Arial"/>
                 <w:b/>
                 <w:bCs/>
-                <w:color w:val="C00000"/>
+                <w:color w:val="0070C0"/>
                 <w:sz w:val="32"/>
                 <w:szCs w:val="32"/>
               </w:rPr>
-              <w:t xml:space="preserve">TAKE A PALLET OUT</w:t>
+              <w:t xml:space="preserve">MOVE A PALLET</w:t>
             </w:r>
           </w:p>
           <w:p>
@@ -257,7 +267,7 @@
                 <w:rFonts w:ascii="Arial" w:cs="Arial" w:eastAsia="Arial" w:hAnsi="Arial"/>
                 <w:b/>
                 <w:bCs/>
-                <w:color w:val="C00000"/>
+                <w:color w:val="0070C0"/>
                 <w:sz w:val="26"/>
                 <w:szCs w:val="26"/>
               </w:rPr>
@@ -266,10 +276,20 @@
             <w:r>
               <w:rPr>
                 <w:rFonts w:ascii="Arial" w:cs="Arial" w:eastAsia="Arial" w:hAnsi="Arial"/>
-                <w:sz w:val="26"/>
-                <w:szCs w:val="26"/>
-              </w:rPr>
-              <w:t xml:space="preserve">Click the square.</w:t>
+                <w:b/>
+                <w:bCs/>
+                <w:sz w:val="26"/>
+                <w:szCs w:val="26"/>
+              </w:rPr>
+              <w:t xml:space="preserve">Double-click</w:t>
+            </w:r>
+            <w:r>
+              <w:rPr>
+                <w:rFonts w:ascii="Arial" w:cs="Arial" w:eastAsia="Arial" w:hAnsi="Arial"/>
+                <w:sz w:val="26"/>
+                <w:szCs w:val="26"/>
+              </w:rPr>
+              <w:t xml:space="preserve"> the pallet. It gets a black border.</w:t>
             </w:r>
           </w:p>
           <w:p>
@@ -281,7 +301,7 @@
                 <w:rFonts w:ascii="Arial" w:cs="Arial" w:eastAsia="Arial" w:hAnsi="Arial"/>
                 <w:b/>
                 <w:bCs/>
-                <w:color w:val="C00000"/>
+                <w:color w:val="0070C0"/>
                 <w:sz w:val="26"/>
                 <w:szCs w:val="26"/>
               </w:rPr>
@@ -293,25 +313,67 @@
                 <w:sz w:val="26"/>
                 <w:szCs w:val="26"/>
               </w:rPr>
-              <w:t xml:space="preserve">Press </w:t>
-            </w:r>
-            <w:r>
-              <w:rPr>
-                <w:rFonts w:ascii="Arial" w:cs="Arial" w:eastAsia="Arial" w:hAnsi="Arial"/>
-                <w:b/>
-                <w:bCs/>
-                <w:sz w:val="26"/>
-                <w:szCs w:val="26"/>
-              </w:rPr>
-              <w:t xml:space="preserve">Delete</w:t>
-            </w:r>
-            <w:r>
-              <w:rPr>
-                <w:rFonts w:ascii="Arial" w:cs="Arial" w:eastAsia="Arial" w:hAnsi="Arial"/>
-                <w:sz w:val="26"/>
-                <w:szCs w:val="26"/>
-              </w:rPr>
-              <w:t xml:space="preserve">. The square goes back to stripes.</w:t>
+              <w:t xml:space="preserve">Click where it goes. Click another pallet to </w:t>
+            </w:r>
+            <w:r>
+              <w:rPr>
+                <w:rFonts w:ascii="Arial" w:cs="Arial" w:eastAsia="Arial" w:hAnsi="Arial"/>
+                <w:b/>
+                <w:bCs/>
+                <w:sz w:val="26"/>
+                <w:szCs w:val="26"/>
+              </w:rPr>
+              <w:t xml:space="preserve">swap</w:t>
+            </w:r>
+            <w:r>
+              <w:rPr>
+                <w:rFonts w:ascii="Arial" w:cs="Arial" w:eastAsia="Arial" w:hAnsi="Arial"/>
+                <w:sz w:val="26"/>
+                <w:szCs w:val="26"/>
+              </w:rPr>
+              <w:t xml:space="preserve"> them.</w:t>
+            </w:r>
+          </w:p>
+          <w:p>
+            <w:pPr>
+              <w:spacing w:after="70"/>
+            </w:pPr>
+            <w:r>
+              <w:rPr>
+                <w:rFonts w:ascii="Arial" w:cs="Arial" w:eastAsia="Arial" w:hAnsi="Arial"/>
+                <w:b/>
+                <w:bCs/>
+                <w:color w:val="0070C0"/>
+                <w:sz w:val="26"/>
+                <w:szCs w:val="26"/>
+              </w:rPr>
+              <w:t xml:space="preserve">3.  </w:t>
+            </w:r>
+            <w:r>
+              <w:rPr>
+                <w:rFonts w:ascii="Arial" w:cs="Arial" w:eastAsia="Arial" w:hAnsi="Arial"/>
+                <w:sz w:val="26"/>
+                <w:szCs w:val="26"/>
+              </w:rPr>
+              <w:t xml:space="preserve">Changed your mind? Press </w:t>
+            </w:r>
+            <w:r>
+              <w:rPr>
+                <w:rFonts w:ascii="Arial" w:cs="Arial" w:eastAsia="Arial" w:hAnsi="Arial"/>
+                <w:b/>
+                <w:bCs/>
+                <w:sz w:val="26"/>
+                <w:szCs w:val="26"/>
+              </w:rPr>
+              <w:t xml:space="preserve">Esc</w:t>
+            </w:r>
+            <w:r>
+              <w:rPr>
+                <w:rFonts w:ascii="Arial" w:cs="Arial" w:eastAsia="Arial" w:hAnsi="Arial"/>
+                <w:sz w:val="26"/>
+                <w:szCs w:val="26"/>
+              </w:rPr>
+              <w:t xml:space="preserve">.</w:t>
             </w:r>
           </w:p>
         </w:tc>
@@ -343,7 +405,7 @@
             <w:tcW w:type="dxa" w:w="9638"/>
             <w:tcBorders>
               <w:top w:val="none" w:color="FFFFFF" w:sz="0"/>
-              <w:left w:val="single" w:color="0070C0" w:sz="48"/>
+              <w:left w:val="single" w:color="C00000" w:sz="48"/>
               <w:bottom w:val="none" w:color="FFFFFF" w:sz="0"/>
               <w:right w:val="none" w:color="FFFFFF" w:sz="0"/>
             </w:tcBorders>
@@ -364,11 +426,11 @@
                 <w:rFonts w:ascii="Arial" w:cs="Arial" w:eastAsia="Arial" w:hAnsi="Arial"/>
                 <w:b/>
                 <w:bCs/>
-                <w:color w:val="0070C0"/>
+                <w:color w:val="C00000"/>
                 <w:sz w:val="32"/>
                 <w:szCs w:val="32"/>
               </w:rPr>
-              <w:t xml:space="preserve">MOVE A PALLET</w:t>
+              <w:t xml:space="preserve">TAKE A PALLET OUT</w:t>
             </w:r>
           </w:p>
           <w:p>
@@ -380,7 +442,7 @@
                 <w:rFonts w:ascii="Arial" w:cs="Arial" w:eastAsia="Arial" w:hAnsi="Arial"/>
                 <w:b/>
                 <w:bCs/>
-                <w:color w:val="0070C0"/>
+                <w:color w:val="C00000"/>
                 <w:sz w:val="26"/>
                 <w:szCs w:val="26"/>
               </w:rPr>
@@ -392,7 +454,31 @@
                 <w:sz w:val="26"/>
                 <w:szCs w:val="26"/>
               </w:rPr>
-              <w:t xml:space="preserve">Take it out of the old square (</w:t>
+              <w:t xml:space="preserve">Click the square.</w:t>
+            </w:r>
+          </w:p>
+          <w:p>
+            <w:pPr>
+              <w:spacing w:after="70"/>
+            </w:pPr>
+            <w:r>
+              <w:rPr>
+                <w:rFonts w:ascii="Arial" w:cs="Arial" w:eastAsia="Arial" w:hAnsi="Arial"/>
+                <w:b/>
+                <w:bCs/>
+                <w:color w:val="C00000"/>
+                <w:sz w:val="26"/>
+                <w:szCs w:val="26"/>
+              </w:rPr>
+              <w:t xml:space="preserve">2.  </w:t>
+            </w:r>
+            <w:r>
+              <w:rPr>
+                <w:rFonts w:ascii="Arial" w:cs="Arial" w:eastAsia="Arial" w:hAnsi="Arial"/>
+                <w:sz w:val="26"/>
+                <w:szCs w:val="26"/>
+              </w:rPr>
+              <w:t xml:space="preserve">Press </w:t>
             </w:r>
             <w:r>
               <w:rPr>
@@ -410,49 +496,7 @@
                 <w:sz w:val="26"/>
                 <w:szCs w:val="26"/>
               </w:rPr>
-              <w:t xml:space="preserve">).</w:t>
-            </w:r>
-          </w:p>
-          <w:p>
-            <w:pPr>
-              <w:spacing w:after="70"/>
-            </w:pPr>
-            <w:r>
-              <w:rPr>
-                <w:rFonts w:ascii="Arial" w:cs="Arial" w:eastAsia="Arial" w:hAnsi="Arial"/>
-                <w:b/>
-                <w:bCs/>
-                <w:color w:val="0070C0"/>
-                <w:sz w:val="26"/>
-                <w:szCs w:val="26"/>
-              </w:rPr>
-              <w:t xml:space="preserve">2.  </w:t>
-            </w:r>
-            <w:r>
-              <w:rPr>
-                <w:rFonts w:ascii="Arial" w:cs="Arial" w:eastAsia="Arial" w:hAnsi="Arial"/>
-                <w:sz w:val="26"/>
-                <w:szCs w:val="26"/>
-              </w:rPr>
-              <w:t xml:space="preserve">Put it in the new square (</w:t>
-            </w:r>
-            <w:r>
-              <w:rPr>
-                <w:rFonts w:ascii="Arial" w:cs="Arial" w:eastAsia="Arial" w:hAnsi="Arial"/>
-                <w:b/>
-                <w:bCs/>
-                <w:sz w:val="26"/>
-                <w:szCs w:val="26"/>
-              </w:rPr>
-              <w:t xml:space="preserve">arrow</w:t>
-            </w:r>
-            <w:r>
-              <w:rPr>
-                <w:rFonts w:ascii="Arial" w:cs="Arial" w:eastAsia="Arial" w:hAnsi="Arial"/>
-                <w:sz w:val="26"/>
-                <w:szCs w:val="26"/>
-              </w:rPr>
-              <w:t xml:space="preserve">, then pick).</w:t>
+              <w:t xml:space="preserve">. The square goes back to stripes.</w:t>
             </w:r>
           </w:p>
         </w:tc>
@@ -476,25 +520,20 @@
         </w:tblBorders>
       </w:tblPr>
       <w:tblGrid>
-        <w:gridCol w:w="9638"/>
+        <w:gridCol w:w="2200"/>
+        <w:gridCol w:w="7438"/>
       </w:tblGrid>
       <w:tr>
         <w:tc>
           <w:tcPr>
             <w:tcW w:type="dxa" w:w="9638"/>
+            <w:gridSpan w:val="2"/>
             <w:tcBorders>
               <w:top w:val="none" w:color="FFFFFF" w:sz="0"/>
-              <w:left w:val="single" w:color="E6007E" w:sz="48"/>
+              <w:left w:val="none" w:color="FFFFFF" w:sz="0"/>
               <w:bottom w:val="none" w:color="FFFFFF" w:sz="0"/>
               <w:right w:val="none" w:color="FFFFFF" w:sz="0"/>
             </w:tcBorders>
-            <w:shd w:fill="F5F5F5" w:color="auto" w:val="clear"/>
-            <w:tcMar>
-              <w:top w:type="dxa" w:w="100"/>
-              <w:left w:type="dxa" w:w="260"/>
-              <w:bottom w:type="dxa" w:w="80"/>
-              <w:right w:type="dxa" w:w="200"/>
-            </w:tcMar>
           </w:tcPr>
           <w:p>
             <w:pPr>
@@ -505,320 +544,335 @@
                 <w:rFonts w:ascii="Arial" w:cs="Arial" w:eastAsia="Arial" w:hAnsi="Arial"/>
                 <w:b/>
                 <w:bCs/>
-                <w:color w:val="E6007E"/>
                 <w:sz w:val="32"/>
                 <w:szCs w:val="32"/>
               </w:rPr>
-              <w:t xml:space="preserve">NEW ITEM?</w:t>
-            </w:r>
-          </w:p>
-          <w:p>
-            <w:pPr>
-              <w:spacing w:after="70"/>
-            </w:pPr>
-            <w:r>
-              <w:rPr>
-                <w:rFonts w:ascii="Arial" w:cs="Arial" w:eastAsia="Arial" w:hAnsi="Arial"/>
-                <w:b/>
-                <w:bCs/>
-                <w:color w:val="E6007E"/>
-                <w:sz w:val="26"/>
-                <w:szCs w:val="26"/>
-              </w:rPr>
-              <w:t xml:space="preserve">1.  </w:t>
-            </w:r>
-            <w:r>
-              <w:rPr>
-                <w:rFonts w:ascii="Arial" w:cs="Arial" w:eastAsia="Arial" w:hAnsi="Arial"/>
-                <w:sz w:val="26"/>
-                <w:szCs w:val="26"/>
-              </w:rPr>
-              <w:t xml:space="preserve">Go to the </w:t>
-            </w:r>
-            <w:r>
-              <w:rPr>
-                <w:rFonts w:ascii="Arial" w:cs="Arial" w:eastAsia="Arial" w:hAnsi="Arial"/>
-                <w:b/>
-                <w:bCs/>
-                <w:sz w:val="26"/>
-                <w:szCs w:val="26"/>
-              </w:rPr>
-              <w:t xml:space="preserve">Stock</w:t>
-            </w:r>
-            <w:r>
-              <w:rPr>
-                <w:rFonts w:ascii="Arial" w:cs="Arial" w:eastAsia="Arial" w:hAnsi="Arial"/>
-                <w:sz w:val="26"/>
-                <w:szCs w:val="26"/>
-              </w:rPr>
-              <w:t xml:space="preserve"> sheet.</w:t>
-            </w:r>
-          </w:p>
-          <w:p>
-            <w:pPr>
-              <w:spacing w:after="70"/>
-            </w:pPr>
-            <w:r>
-              <w:rPr>
-                <w:rFonts w:ascii="Arial" w:cs="Arial" w:eastAsia="Arial" w:hAnsi="Arial"/>
-                <w:b/>
-                <w:bCs/>
-                <w:color w:val="E6007E"/>
-                <w:sz w:val="26"/>
-                <w:szCs w:val="26"/>
-              </w:rPr>
-              <w:t xml:space="preserve">2.  </w:t>
-            </w:r>
-            <w:r>
-              <w:rPr>
-                <w:rFonts w:ascii="Arial" w:cs="Arial" w:eastAsia="Arial" w:hAnsi="Arial"/>
-                <w:sz w:val="26"/>
-                <w:szCs w:val="26"/>
-              </w:rPr>
-              <w:t xml:space="preserve">Type it on the first empty row: </w:t>
-            </w:r>
-            <w:r>
-              <w:rPr>
-                <w:rFonts w:ascii="Arial" w:cs="Arial" w:eastAsia="Arial" w:hAnsi="Arial"/>
-                <w:b/>
-                <w:bCs/>
-                <w:sz w:val="26"/>
-                <w:szCs w:val="26"/>
-              </w:rPr>
-              <w:t xml:space="preserve">code</w:t>
-            </w:r>
-            <w:r>
-              <w:rPr>
-                <w:rFonts w:ascii="Arial" w:cs="Arial" w:eastAsia="Arial" w:hAnsi="Arial"/>
-                <w:sz w:val="26"/>
-                <w:szCs w:val="26"/>
-              </w:rPr>
-              <w:t xml:space="preserve">, </w:t>
-            </w:r>
-            <w:r>
-              <w:rPr>
-                <w:rFonts w:ascii="Arial" w:cs="Arial" w:eastAsia="Arial" w:hAnsi="Arial"/>
-                <w:b/>
-                <w:bCs/>
-                <w:sz w:val="26"/>
-                <w:szCs w:val="26"/>
-              </w:rPr>
-              <w:t xml:space="preserve">description</w:t>
-            </w:r>
-            <w:r>
-              <w:rPr>
-                <w:rFonts w:ascii="Arial" w:cs="Arial" w:eastAsia="Arial" w:hAnsi="Arial"/>
-                <w:sz w:val="26"/>
-                <w:szCs w:val="26"/>
-              </w:rPr>
-              <w:t xml:space="preserve">, </w:t>
-            </w:r>
-            <w:r>
-              <w:rPr>
-                <w:rFonts w:ascii="Arial" w:cs="Arial" w:eastAsia="Arial" w:hAnsi="Arial"/>
-                <w:b/>
-                <w:bCs/>
-                <w:sz w:val="26"/>
-                <w:szCs w:val="26"/>
-              </w:rPr>
-              <w:t xml:space="preserve">zone</w:t>
-            </w:r>
-            <w:r>
-              <w:rPr>
-                <w:rFonts w:ascii="Arial" w:cs="Arial" w:eastAsia="Arial" w:hAnsi="Arial"/>
-                <w:sz w:val="26"/>
-                <w:szCs w:val="26"/>
-              </w:rPr>
-              <w:t xml:space="preserve">.</w:t>
-            </w:r>
-          </w:p>
-          <w:p>
-            <w:pPr>
-              <w:spacing w:after="70"/>
-            </w:pPr>
-            <w:r>
-              <w:rPr>
-                <w:rFonts w:ascii="Arial" w:cs="Arial" w:eastAsia="Arial" w:hAnsi="Arial"/>
-                <w:b/>
-                <w:bCs/>
-                <w:color w:val="E6007E"/>
-                <w:sz w:val="26"/>
-                <w:szCs w:val="26"/>
-              </w:rPr>
-              <w:t xml:space="preserve">3.  </w:t>
-            </w:r>
-            <w:r>
-              <w:rPr>
-                <w:rFonts w:ascii="Arial" w:cs="Arial" w:eastAsia="Arial" w:hAnsi="Arial"/>
-                <w:sz w:val="26"/>
-                <w:szCs w:val="26"/>
-              </w:rPr>
-              <w:t xml:space="preserve">It now shows up in the arrow list on the Map.</w:t>
+              <w:t xml:space="preserve">THE BUTTONS (top of the Map)</w:t>
             </w:r>
           </w:p>
         </w:tc>
       </w:tr>
-    </w:tbl>
-    <w:p>
-      <w:pPr>
-        <w:spacing w:after="90"/>
-      </w:pPr>
-    </w:p>
-    <w:tbl>
-      <w:tblPr>
-        <w:tblW w:type="dxa" w:w="9638"/>
-        <w:tblBorders>
-          <w:top w:val="single" w:color="auto" w:sz="4"/>
-          <w:left w:val="single" w:color="auto" w:sz="4"/>
-          <w:bottom w:val="single" w:color="auto" w:sz="4"/>
-          <w:right w:val="single" w:color="auto" w:sz="4"/>
-          <w:insideH w:val="single" w:color="auto" w:sz="4"/>
-          <w:insideV w:val="single" w:color="auto" w:sz="4"/>
-        </w:tblBorders>
-      </w:tblPr>
-      <w:tblGrid>
-        <w:gridCol w:w="9638"/>
-      </w:tblGrid>
       <w:tr>
         <w:tc>
           <w:tcPr>
-            <w:tcW w:type="dxa" w:w="9638"/>
+            <w:tcW w:type="dxa" w:w="2200"/>
+            <w:tcBorders>
+              <w:top w:val="single" w:color="FFFFFF" w:sz="24"/>
+              <w:left w:val="none" w:color="FFFFFF" w:sz="0"/>
+              <w:bottom w:val="single" w:color="FFFFFF" w:sz="24"/>
+              <w:right w:val="none" w:color="FFFFFF" w:sz="0"/>
+            </w:tcBorders>
+            <w:shd w:fill="E6007E" w:color="auto" w:val="clear"/>
+            <w:tcMar>
+              <w:top w:type="dxa" w:w="60"/>
+              <w:bottom w:type="dxa" w:w="60"/>
+            </w:tcMar>
+            <w:vAlign w:val="center"/>
+          </w:tcPr>
+          <w:p>
+            <w:pPr>
+              <w:jc w:val="center"/>
+            </w:pPr>
+            <w:r>
+              <w:rPr>
+                <w:rFonts w:ascii="Arial" w:cs="Arial" w:eastAsia="Arial" w:hAnsi="Arial"/>
+                <w:b/>
+                <w:bCs/>
+                <w:color w:val="FFFFFF"/>
+                <w:sz w:val="24"/>
+                <w:szCs w:val="24"/>
+              </w:rPr>
+              <w:t xml:space="preserve">Find space</w:t>
+            </w:r>
+          </w:p>
+        </w:tc>
+        <w:tc>
+          <w:tcPr>
+            <w:tcW w:type="dxa" w:w="7438"/>
             <w:tcBorders>
               <w:top w:val="none" w:color="FFFFFF" w:sz="0"/>
-              <w:left w:val="single" w:color="404040" w:sz="48"/>
+              <w:left w:val="none" w:color="FFFFFF" w:sz="0"/>
               <w:bottom w:val="none" w:color="FFFFFF" w:sz="0"/>
               <w:right w:val="none" w:color="FFFFFF" w:sz="0"/>
             </w:tcBorders>
-            <w:shd w:fill="F5F5F5" w:color="auto" w:val="clear"/>
             <w:tcMar>
-              <w:top w:type="dxa" w:w="100"/>
-              <w:left w:type="dxa" w:w="260"/>
-              <w:bottom w:type="dxa" w:w="80"/>
-              <w:right w:type="dxa" w:w="200"/>
+              <w:top w:type="dxa" w:w="60"/>
+              <w:left w:type="dxa" w:w="200"/>
+              <w:bottom w:type="dxa" w:w="60"/>
             </w:tcMar>
-          </w:tcPr>
-          <w:p>
-            <w:pPr>
-              <w:spacing w:after="100"/>
-            </w:pPr>
-            <w:r>
-              <w:rPr>
-                <w:rFonts w:ascii="Arial" w:cs="Arial" w:eastAsia="Arial" w:hAnsi="Arial"/>
-                <w:b/>
-                <w:bCs/>
-                <w:color w:val="404040"/>
-                <w:sz w:val="32"/>
-                <w:szCs w:val="32"/>
-              </w:rPr>
-              <w:t xml:space="preserve">CHANGE A ZONE NAME?</w:t>
-            </w:r>
-          </w:p>
-          <w:p>
-            <w:pPr>
-              <w:spacing w:after="70"/>
-            </w:pPr>
-            <w:r>
-              <w:rPr>
-                <w:rFonts w:ascii="Arial" w:cs="Arial" w:eastAsia="Arial" w:hAnsi="Arial"/>
-                <w:b/>
-                <w:bCs/>
-                <w:color w:val="404040"/>
-                <w:sz w:val="26"/>
-                <w:szCs w:val="26"/>
-              </w:rPr>
-              <w:t xml:space="preserve">1.  </w:t>
-            </w:r>
-            <w:r>
-              <w:rPr>
-                <w:rFonts w:ascii="Arial" w:cs="Arial" w:eastAsia="Arial" w:hAnsi="Arial"/>
-                <w:sz w:val="26"/>
-                <w:szCs w:val="26"/>
-              </w:rPr>
-              <w:t xml:space="preserve">Go to the </w:t>
-            </w:r>
-            <w:r>
-              <w:rPr>
-                <w:rFonts w:ascii="Arial" w:cs="Arial" w:eastAsia="Arial" w:hAnsi="Arial"/>
-                <w:b/>
-                <w:bCs/>
-                <w:sz w:val="26"/>
-                <w:szCs w:val="26"/>
-              </w:rPr>
-              <w:t xml:space="preserve">Stock</w:t>
-            </w:r>
-            <w:r>
-              <w:rPr>
-                <w:rFonts w:ascii="Arial" w:cs="Arial" w:eastAsia="Arial" w:hAnsi="Arial"/>
-                <w:sz w:val="26"/>
-                <w:szCs w:val="26"/>
-              </w:rPr>
-              <w:t xml:space="preserve"> sheet.</w:t>
-            </w:r>
-          </w:p>
-          <w:p>
-            <w:pPr>
-              <w:spacing w:after="70"/>
-            </w:pPr>
-            <w:r>
-              <w:rPr>
-                <w:rFonts w:ascii="Arial" w:cs="Arial" w:eastAsia="Arial" w:hAnsi="Arial"/>
-                <w:b/>
-                <w:bCs/>
-                <w:color w:val="404040"/>
-                <w:sz w:val="26"/>
-                <w:szCs w:val="26"/>
-              </w:rPr>
-              <w:t xml:space="preserve">2.  </w:t>
-            </w:r>
-            <w:r>
-              <w:rPr>
-                <w:rFonts w:ascii="Arial" w:cs="Arial" w:eastAsia="Arial" w:hAnsi="Arial"/>
-                <w:sz w:val="26"/>
-                <w:szCs w:val="26"/>
-              </w:rPr>
-              <w:t xml:space="preserve">Type over the name in the </w:t>
-            </w:r>
-            <w:r>
-              <w:rPr>
-                <w:rFonts w:ascii="Arial" w:cs="Arial" w:eastAsia="Arial" w:hAnsi="Arial"/>
-                <w:b/>
-                <w:bCs/>
-                <w:sz w:val="26"/>
-                <w:szCs w:val="26"/>
-              </w:rPr>
-              <w:t xml:space="preserve">pink box</w:t>
-            </w:r>
-            <w:r>
-              <w:rPr>
-                <w:rFonts w:ascii="Arial" w:cs="Arial" w:eastAsia="Arial" w:hAnsi="Arial"/>
-                <w:sz w:val="26"/>
-                <w:szCs w:val="26"/>
-              </w:rPr>
-              <w:t xml:space="preserve"> on the right.</w:t>
-            </w:r>
-          </w:p>
-          <w:p>
-            <w:pPr>
-              <w:spacing w:after="70"/>
-            </w:pPr>
-            <w:r>
-              <w:rPr>
-                <w:rFonts w:ascii="Arial" w:cs="Arial" w:eastAsia="Arial" w:hAnsi="Arial"/>
-                <w:b/>
-                <w:bCs/>
-                <w:color w:val="404040"/>
-                <w:sz w:val="26"/>
-                <w:szCs w:val="26"/>
-              </w:rPr>
-              <w:t xml:space="preserve">3.  </w:t>
-            </w:r>
-            <w:r>
-              <w:rPr>
-                <w:rFonts w:ascii="Arial" w:cs="Arial" w:eastAsia="Arial" w:hAnsi="Arial"/>
-                <w:sz w:val="26"/>
-                <w:szCs w:val="26"/>
-              </w:rPr>
-              <w:t xml:space="preserve">The Map changes by itself.</w:t>
+            <w:vAlign w:val="center"/>
+          </w:tcPr>
+          <w:p>
+            <w:pPr>
+              <w:spacing w:after="0"/>
+            </w:pPr>
+            <w:r>
+              <w:rPr>
+                <w:rFonts w:ascii="Arial" w:cs="Arial" w:eastAsia="Arial" w:hAnsi="Arial"/>
+                <w:sz w:val="24"/>
+                <w:szCs w:val="24"/>
+              </w:rPr>
+              <w:t xml:space="preserve">Pick an item and how many pallets: it shows the nearest free squares and fills them.</w:t>
+            </w:r>
+          </w:p>
+        </w:tc>
+      </w:tr>
+      <w:tr>
+        <w:tc>
+          <w:tcPr>
+            <w:tcW w:type="dxa" w:w="2200"/>
+            <w:tcBorders>
+              <w:top w:val="single" w:color="FFFFFF" w:sz="24"/>
+              <w:left w:val="none" w:color="FFFFFF" w:sz="0"/>
+              <w:bottom w:val="single" w:color="FFFFFF" w:sz="24"/>
+              <w:right w:val="none" w:color="FFFFFF" w:sz="0"/>
+            </w:tcBorders>
+            <w:shd w:fill="E6007E" w:color="auto" w:val="clear"/>
+            <w:tcMar>
+              <w:top w:type="dxa" w:w="60"/>
+              <w:bottom w:type="dxa" w:w="60"/>
+            </w:tcMar>
+            <w:vAlign w:val="center"/>
+          </w:tcPr>
+          <w:p>
+            <w:pPr>
+              <w:jc w:val="center"/>
+            </w:pPr>
+            <w:r>
+              <w:rPr>
+                <w:rFonts w:ascii="Arial" w:cs="Arial" w:eastAsia="Arial" w:hAnsi="Arial"/>
+                <w:b/>
+                <w:bCs/>
+                <w:color w:val="FFFFFF"/>
+                <w:sz w:val="24"/>
+                <w:szCs w:val="24"/>
+              </w:rPr>
+              <w:t xml:space="preserve">Find item</w:t>
+            </w:r>
+          </w:p>
+        </w:tc>
+        <w:tc>
+          <w:tcPr>
+            <w:tcW w:type="dxa" w:w="7438"/>
+            <w:tcBorders>
+              <w:top w:val="none" w:color="FFFFFF" w:sz="0"/>
+              <w:left w:val="none" w:color="FFFFFF" w:sz="0"/>
+              <w:bottom w:val="none" w:color="FFFFFF" w:sz="0"/>
+              <w:right w:val="none" w:color="FFFFFF" w:sz="0"/>
+            </w:tcBorders>
+            <w:tcMar>
+              <w:top w:type="dxa" w:w="60"/>
+              <w:left w:type="dxa" w:w="200"/>
+              <w:bottom w:type="dxa" w:w="60"/>
+            </w:tcMar>
+            <w:vAlign w:val="center"/>
+          </w:tcPr>
+          <w:p>
+            <w:pPr>
+              <w:spacing w:after="0"/>
+            </w:pPr>
+            <w:r>
+              <w:rPr>
+                <w:rFonts w:ascii="Arial" w:cs="Arial" w:eastAsia="Arial" w:hAnsi="Arial"/>
+                <w:sz w:val="24"/>
+                <w:szCs w:val="24"/>
+              </w:rPr>
+              <w:t xml:space="preserve">Shows every pallet of an item with a pink border.</w:t>
+            </w:r>
+          </w:p>
+        </w:tc>
+      </w:tr>
+      <w:tr>
+        <w:tc>
+          <w:tcPr>
+            <w:tcW w:type="dxa" w:w="2200"/>
+            <w:tcBorders>
+              <w:top w:val="single" w:color="FFFFFF" w:sz="24"/>
+              <w:left w:val="none" w:color="FFFFFF" w:sz="0"/>
+              <w:bottom w:val="single" w:color="FFFFFF" w:sz="24"/>
+              <w:right w:val="none" w:color="FFFFFF" w:sz="0"/>
+            </w:tcBorders>
+            <w:shd w:fill="C00000" w:color="auto" w:val="clear"/>
+            <w:tcMar>
+              <w:top w:type="dxa" w:w="60"/>
+              <w:bottom w:type="dxa" w:w="60"/>
+            </w:tcMar>
+            <w:vAlign w:val="center"/>
+          </w:tcPr>
+          <w:p>
+            <w:pPr>
+              <w:jc w:val="center"/>
+            </w:pPr>
+            <w:r>
+              <w:rPr>
+                <w:rFonts w:ascii="Arial" w:cs="Arial" w:eastAsia="Arial" w:hAnsi="Arial"/>
+                <w:b/>
+                <w:bCs/>
+                <w:color w:val="FFFFFF"/>
+                <w:sz w:val="24"/>
+                <w:szCs w:val="24"/>
+              </w:rPr>
+              <w:t xml:space="preserve">Low stock</w:t>
+            </w:r>
+          </w:p>
+        </w:tc>
+        <w:tc>
+          <w:tcPr>
+            <w:tcW w:type="dxa" w:w="7438"/>
+            <w:tcBorders>
+              <w:top w:val="none" w:color="FFFFFF" w:sz="0"/>
+              <w:left w:val="none" w:color="FFFFFF" w:sz="0"/>
+              <w:bottom w:val="none" w:color="FFFFFF" w:sz="0"/>
+              <w:right w:val="none" w:color="FFFFFF" w:sz="0"/>
+            </w:tcBorders>
+            <w:tcMar>
+              <w:top w:type="dxa" w:w="60"/>
+              <w:left w:type="dxa" w:w="200"/>
+              <w:bottom w:type="dxa" w:w="60"/>
+            </w:tcMar>
+            <w:vAlign w:val="center"/>
+          </w:tcPr>
+          <w:p>
+            <w:pPr>
+              <w:spacing w:after="0"/>
+            </w:pPr>
+            <w:r>
+              <w:rPr>
+                <w:rFonts w:ascii="Arial" w:cs="Arial" w:eastAsia="Arial" w:hAnsi="Arial"/>
+                <w:sz w:val="24"/>
+                <w:szCs w:val="24"/>
+              </w:rPr>
+              <w:t xml:space="preserve">Lists everything that's running low.</w:t>
+            </w:r>
+          </w:p>
+        </w:tc>
+      </w:tr>
+      <w:tr>
+        <w:tc>
+          <w:tcPr>
+            <w:tcW w:type="dxa" w:w="2200"/>
+            <w:tcBorders>
+              <w:top w:val="single" w:color="FFFFFF" w:sz="24"/>
+              <w:left w:val="none" w:color="FFFFFF" w:sz="0"/>
+              <w:bottom w:val="single" w:color="FFFFFF" w:sz="24"/>
+              <w:right w:val="none" w:color="FFFFFF" w:sz="0"/>
+            </w:tcBorders>
+            <w:shd w:fill="404040" w:color="auto" w:val="clear"/>
+            <w:tcMar>
+              <w:top w:type="dxa" w:w="60"/>
+              <w:bottom w:type="dxa" w:w="60"/>
+            </w:tcMar>
+            <w:vAlign w:val="center"/>
+          </w:tcPr>
+          <w:p>
+            <w:pPr>
+              <w:jc w:val="center"/>
+            </w:pPr>
+            <w:r>
+              <w:rPr>
+                <w:rFonts w:ascii="Arial" w:cs="Arial" w:eastAsia="Arial" w:hAnsi="Arial"/>
+                <w:b/>
+                <w:bCs/>
+                <w:color w:val="FFFFFF"/>
+                <w:sz w:val="24"/>
+                <w:szCs w:val="24"/>
+              </w:rPr>
+              <w:t xml:space="preserve">Undo</w:t>
+            </w:r>
+          </w:p>
+        </w:tc>
+        <w:tc>
+          <w:tcPr>
+            <w:tcW w:type="dxa" w:w="7438"/>
+            <w:tcBorders>
+              <w:top w:val="none" w:color="FFFFFF" w:sz="0"/>
+              <w:left w:val="none" w:color="FFFFFF" w:sz="0"/>
+              <w:bottom w:val="none" w:color="FFFFFF" w:sz="0"/>
+              <w:right w:val="none" w:color="FFFFFF" w:sz="0"/>
+            </w:tcBorders>
+            <w:tcMar>
+              <w:top w:type="dxa" w:w="60"/>
+              <w:left w:type="dxa" w:w="200"/>
+              <w:bottom w:type="dxa" w:w="60"/>
+            </w:tcMar>
+            <w:vAlign w:val="center"/>
+          </w:tcPr>
+          <w:p>
+            <w:pPr>
+              <w:spacing w:after="0"/>
+            </w:pPr>
+            <w:r>
+              <w:rPr>
+                <w:rFonts w:ascii="Arial" w:cs="Arial" w:eastAsia="Arial" w:hAnsi="Arial"/>
+                <w:sz w:val="24"/>
+                <w:szCs w:val="24"/>
+              </w:rPr>
+              <w:t xml:space="preserve">Takes back the last change.</w:t>
+            </w:r>
+          </w:p>
+        </w:tc>
+      </w:tr>
+      <w:tr>
+        <w:tc>
+          <w:tcPr>
+            <w:tcW w:type="dxa" w:w="2200"/>
+            <w:tcBorders>
+              <w:top w:val="single" w:color="FFFFFF" w:sz="24"/>
+              <w:left w:val="none" w:color="FFFFFF" w:sz="0"/>
+              <w:bottom w:val="single" w:color="FFFFFF" w:sz="24"/>
+              <w:right w:val="none" w:color="FFFFFF" w:sz="0"/>
+            </w:tcBorders>
+            <w:shd w:fill="808080" w:color="auto" w:val="clear"/>
+            <w:tcMar>
+              <w:top w:type="dxa" w:w="60"/>
+              <w:bottom w:type="dxa" w:w="60"/>
+            </w:tcMar>
+            <w:vAlign w:val="center"/>
+          </w:tcPr>
+          <w:p>
+            <w:pPr>
+              <w:jc w:val="center"/>
+            </w:pPr>
+            <w:r>
+              <w:rPr>
+                <w:rFonts w:ascii="Arial" w:cs="Arial" w:eastAsia="Arial" w:hAnsi="Arial"/>
+                <w:b/>
+                <w:bCs/>
+                <w:color w:val="FFFFFF"/>
+                <w:sz w:val="24"/>
+                <w:szCs w:val="24"/>
+              </w:rPr>
+              <w:t xml:space="preserve">Clear</w:t>
+            </w:r>
+          </w:p>
+        </w:tc>
+        <w:tc>
+          <w:tcPr>
+            <w:tcW w:type="dxa" w:w="7438"/>
+            <w:tcBorders>
+              <w:top w:val="none" w:color="FFFFFF" w:sz="0"/>
+              <w:left w:val="none" w:color="FFFFFF" w:sz="0"/>
+              <w:bottom w:val="none" w:color="FFFFFF" w:sz="0"/>
+              <w:right w:val="none" w:color="FFFFFF" w:sz="0"/>
+            </w:tcBorders>
+            <w:tcMar>
+              <w:top w:type="dxa" w:w="60"/>
+              <w:left w:type="dxa" w:w="200"/>
+              <w:bottom w:type="dxa" w:w="60"/>
+            </w:tcMar>
+            <w:vAlign w:val="center"/>
+          </w:tcPr>
+          <w:p>
+            <w:pPr>
+              <w:spacing w:after="0"/>
+            </w:pPr>
+            <w:r>
+              <w:rPr>
+                <w:rFonts w:ascii="Arial" w:cs="Arial" w:eastAsia="Arial" w:hAnsi="Arial"/>
+                <w:sz w:val="24"/>
+                <w:szCs w:val="24"/>
+              </w:rPr>
+              <w:t xml:space="preserve">Removes the pink borders and cancels a move.</w:t>
             </w:r>
           </w:p>
         </w:tc>
@@ -1176,7 +1230,7 @@
     </w:tbl>
     <w:p>
       <w:pPr>
-        <w:spacing w:after="140"/>
+        <w:spacing w:after="120"/>
       </w:pPr>
     </w:p>
     <w:p>
@@ -1200,6 +1254,779 @@
           <w:szCs w:val="24"/>
         </w:rPr>
         <w:t xml:space="preserve"> on the Stock sheet means you're nearly out: time to order.</w:t>
+      </w:r>
+    </w:p>
+    <w:p>
+      <w:pPr>
+        <w:pageBreakBefore/>
+        <w:pBdr>
+          <w:bottom w:val="single" w:color="E6007E" w:sz="24" w:space="6"/>
+        </w:pBdr>
+        <w:spacing w:after="200"/>
+      </w:pPr>
+      <w:r>
+        <w:rPr>
+          <w:rFonts w:ascii="Arial" w:cs="Arial" w:eastAsia="Arial" w:hAnsi="Arial"/>
+          <w:b/>
+          <w:bCs/>
+          <w:sz w:val="44"/>
+          <w:szCs w:val="44"/>
+        </w:rPr>
+        <w:t xml:space="preserve">Setting up</w:t>
+      </w:r>
+    </w:p>
+    <w:tbl>
+      <w:tblPr>
+        <w:tblW w:type="dxa" w:w="9638"/>
+        <w:tblBorders>
+          <w:top w:val="single" w:color="auto" w:sz="4"/>
+          <w:left w:val="single" w:color="auto" w:sz="4"/>
+          <w:bottom w:val="single" w:color="auto" w:sz="4"/>
+          <w:right w:val="single" w:color="auto" w:sz="4"/>
+          <w:insideH w:val="single" w:color="auto" w:sz="4"/>
+          <w:insideV w:val="single" w:color="auto" w:sz="4"/>
+        </w:tblBorders>
+      </w:tblPr>
+      <w:tblGrid>
+        <w:gridCol w:w="9638"/>
+      </w:tblGrid>
+      <w:tr>
+        <w:tc>
+          <w:tcPr>
+            <w:tcW w:type="dxa" w:w="9638"/>
+            <w:tcBorders>
+              <w:top w:val="none" w:color="FFFFFF" w:sz="0"/>
+              <w:left w:val="single" w:color="E6007E" w:sz="48"/>
+              <w:bottom w:val="none" w:color="FFFFFF" w:sz="0"/>
+              <w:right w:val="none" w:color="FFFFFF" w:sz="0"/>
+            </w:tcBorders>
+            <w:shd w:fill="F5F5F5" w:color="auto" w:val="clear"/>
+            <w:tcMar>
+              <w:top w:type="dxa" w:w="100"/>
+              <w:left w:type="dxa" w:w="260"/>
+              <w:bottom w:type="dxa" w:w="80"/>
+              <w:right w:type="dxa" w:w="200"/>
+            </w:tcMar>
+          </w:tcPr>
+          <w:p>
+            <w:pPr>
+              <w:spacing w:after="100"/>
+            </w:pPr>
+            <w:r>
+              <w:rPr>
+                <w:rFonts w:ascii="Arial" w:cs="Arial" w:eastAsia="Arial" w:hAnsi="Arial"/>
+                <w:b/>
+                <w:bCs/>
+                <w:color w:val="E6007E"/>
+                <w:sz w:val="32"/>
+                <w:szCs w:val="32"/>
+              </w:rPr>
+              <w:t xml:space="preserve">NEW ITEM?</w:t>
+            </w:r>
+          </w:p>
+          <w:p>
+            <w:pPr>
+              <w:spacing w:after="70"/>
+            </w:pPr>
+            <w:r>
+              <w:rPr>
+                <w:rFonts w:ascii="Arial" w:cs="Arial" w:eastAsia="Arial" w:hAnsi="Arial"/>
+                <w:b/>
+                <w:bCs/>
+                <w:color w:val="E6007E"/>
+                <w:sz w:val="26"/>
+                <w:szCs w:val="26"/>
+              </w:rPr>
+              <w:t xml:space="preserve">1.  </w:t>
+            </w:r>
+            <w:r>
+              <w:rPr>
+                <w:rFonts w:ascii="Arial" w:cs="Arial" w:eastAsia="Arial" w:hAnsi="Arial"/>
+                <w:sz w:val="26"/>
+                <w:szCs w:val="26"/>
+              </w:rPr>
+              <w:t xml:space="preserve">Go to the </w:t>
+            </w:r>
+            <w:r>
+              <w:rPr>
+                <w:rFonts w:ascii="Arial" w:cs="Arial" w:eastAsia="Arial" w:hAnsi="Arial"/>
+                <w:b/>
+                <w:bCs/>
+                <w:sz w:val="26"/>
+                <w:szCs w:val="26"/>
+              </w:rPr>
+              <w:t xml:space="preserve">Stock</w:t>
+            </w:r>
+            <w:r>
+              <w:rPr>
+                <w:rFonts w:ascii="Arial" w:cs="Arial" w:eastAsia="Arial" w:hAnsi="Arial"/>
+                <w:sz w:val="26"/>
+                <w:szCs w:val="26"/>
+              </w:rPr>
+              <w:t xml:space="preserve"> sheet.</w:t>
+            </w:r>
+          </w:p>
+          <w:p>
+            <w:pPr>
+              <w:spacing w:after="70"/>
+            </w:pPr>
+            <w:r>
+              <w:rPr>
+                <w:rFonts w:ascii="Arial" w:cs="Arial" w:eastAsia="Arial" w:hAnsi="Arial"/>
+                <w:b/>
+                <w:bCs/>
+                <w:color w:val="E6007E"/>
+                <w:sz w:val="26"/>
+                <w:szCs w:val="26"/>
+              </w:rPr>
+              <w:t xml:space="preserve">2.  </w:t>
+            </w:r>
+            <w:r>
+              <w:rPr>
+                <w:rFonts w:ascii="Arial" w:cs="Arial" w:eastAsia="Arial" w:hAnsi="Arial"/>
+                <w:sz w:val="26"/>
+                <w:szCs w:val="26"/>
+              </w:rPr>
+              <w:t xml:space="preserve">Type it on the first empty row: </w:t>
+            </w:r>
+            <w:r>
+              <w:rPr>
+                <w:rFonts w:ascii="Arial" w:cs="Arial" w:eastAsia="Arial" w:hAnsi="Arial"/>
+                <w:b/>
+                <w:bCs/>
+                <w:sz w:val="26"/>
+                <w:szCs w:val="26"/>
+              </w:rPr>
+              <w:t xml:space="preserve">code</w:t>
+            </w:r>
+            <w:r>
+              <w:rPr>
+                <w:rFonts w:ascii="Arial" w:cs="Arial" w:eastAsia="Arial" w:hAnsi="Arial"/>
+                <w:sz w:val="26"/>
+                <w:szCs w:val="26"/>
+              </w:rPr>
+              <w:t xml:space="preserve">, </w:t>
+            </w:r>
+            <w:r>
+              <w:rPr>
+                <w:rFonts w:ascii="Arial" w:cs="Arial" w:eastAsia="Arial" w:hAnsi="Arial"/>
+                <w:b/>
+                <w:bCs/>
+                <w:sz w:val="26"/>
+                <w:szCs w:val="26"/>
+              </w:rPr>
+              <w:t xml:space="preserve">description</w:t>
+            </w:r>
+            <w:r>
+              <w:rPr>
+                <w:rFonts w:ascii="Arial" w:cs="Arial" w:eastAsia="Arial" w:hAnsi="Arial"/>
+                <w:sz w:val="26"/>
+                <w:szCs w:val="26"/>
+              </w:rPr>
+              <w:t xml:space="preserve">, </w:t>
+            </w:r>
+            <w:r>
+              <w:rPr>
+                <w:rFonts w:ascii="Arial" w:cs="Arial" w:eastAsia="Arial" w:hAnsi="Arial"/>
+                <w:b/>
+                <w:bCs/>
+                <w:sz w:val="26"/>
+                <w:szCs w:val="26"/>
+              </w:rPr>
+              <w:t xml:space="preserve">zone</w:t>
+            </w:r>
+            <w:r>
+              <w:rPr>
+                <w:rFonts w:ascii="Arial" w:cs="Arial" w:eastAsia="Arial" w:hAnsi="Arial"/>
+                <w:sz w:val="26"/>
+                <w:szCs w:val="26"/>
+              </w:rPr>
+              <w:t xml:space="preserve"> (BOX, BAG, FLM or LBL).</w:t>
+            </w:r>
+          </w:p>
+          <w:p>
+            <w:pPr>
+              <w:spacing w:after="70"/>
+            </w:pPr>
+            <w:r>
+              <w:rPr>
+                <w:rFonts w:ascii="Arial" w:cs="Arial" w:eastAsia="Arial" w:hAnsi="Arial"/>
+                <w:b/>
+                <w:bCs/>
+                <w:color w:val="E6007E"/>
+                <w:sz w:val="26"/>
+                <w:szCs w:val="26"/>
+              </w:rPr>
+              <w:t xml:space="preserve">3.  </w:t>
+            </w:r>
+            <w:r>
+              <w:rPr>
+                <w:rFonts w:ascii="Arial" w:cs="Arial" w:eastAsia="Arial" w:hAnsi="Arial"/>
+                <w:sz w:val="26"/>
+                <w:szCs w:val="26"/>
+              </w:rPr>
+              <w:t xml:space="preserve">It now shows up in the lists on the Map.</w:t>
+            </w:r>
+          </w:p>
+        </w:tc>
+      </w:tr>
+    </w:tbl>
+    <w:p>
+      <w:pPr>
+        <w:spacing w:after="90"/>
+      </w:pPr>
+    </w:p>
+    <w:tbl>
+      <w:tblPr>
+        <w:tblW w:type="dxa" w:w="9638"/>
+        <w:tblBorders>
+          <w:top w:val="single" w:color="auto" w:sz="4"/>
+          <w:left w:val="single" w:color="auto" w:sz="4"/>
+          <w:bottom w:val="single" w:color="auto" w:sz="4"/>
+          <w:right w:val="single" w:color="auto" w:sz="4"/>
+          <w:insideH w:val="single" w:color="auto" w:sz="4"/>
+          <w:insideV w:val="single" w:color="auto" w:sz="4"/>
+        </w:tblBorders>
+      </w:tblPr>
+      <w:tblGrid>
+        <w:gridCol w:w="9638"/>
+      </w:tblGrid>
+      <w:tr>
+        <w:tc>
+          <w:tcPr>
+            <w:tcW w:type="dxa" w:w="9638"/>
+            <w:tcBorders>
+              <w:top w:val="none" w:color="FFFFFF" w:sz="0"/>
+              <w:left w:val="single" w:color="404040" w:sz="48"/>
+              <w:bottom w:val="none" w:color="FFFFFF" w:sz="0"/>
+              <w:right w:val="none" w:color="FFFFFF" w:sz="0"/>
+            </w:tcBorders>
+            <w:shd w:fill="F5F5F5" w:color="auto" w:val="clear"/>
+            <w:tcMar>
+              <w:top w:type="dxa" w:w="100"/>
+              <w:left w:type="dxa" w:w="260"/>
+              <w:bottom w:type="dxa" w:w="80"/>
+              <w:right w:type="dxa" w:w="200"/>
+            </w:tcMar>
+          </w:tcPr>
+          <w:p>
+            <w:pPr>
+              <w:spacing w:after="100"/>
+            </w:pPr>
+            <w:r>
+              <w:rPr>
+                <w:rFonts w:ascii="Arial" w:cs="Arial" w:eastAsia="Arial" w:hAnsi="Arial"/>
+                <w:b/>
+                <w:bCs/>
+                <w:color w:val="404040"/>
+                <w:sz w:val="32"/>
+                <w:szCs w:val="32"/>
+              </w:rPr>
+              <w:t xml:space="preserve">CHANGE A ZONE NAME?</w:t>
+            </w:r>
+          </w:p>
+          <w:p>
+            <w:pPr>
+              <w:spacing w:after="70"/>
+            </w:pPr>
+            <w:r>
+              <w:rPr>
+                <w:rFonts w:ascii="Arial" w:cs="Arial" w:eastAsia="Arial" w:hAnsi="Arial"/>
+                <w:b/>
+                <w:bCs/>
+                <w:color w:val="404040"/>
+                <w:sz w:val="26"/>
+                <w:szCs w:val="26"/>
+              </w:rPr>
+              <w:t xml:space="preserve">1.  </w:t>
+            </w:r>
+            <w:r>
+              <w:rPr>
+                <w:rFonts w:ascii="Arial" w:cs="Arial" w:eastAsia="Arial" w:hAnsi="Arial"/>
+                <w:sz w:val="26"/>
+                <w:szCs w:val="26"/>
+              </w:rPr>
+              <w:t xml:space="preserve">Go to the </w:t>
+            </w:r>
+            <w:r>
+              <w:rPr>
+                <w:rFonts w:ascii="Arial" w:cs="Arial" w:eastAsia="Arial" w:hAnsi="Arial"/>
+                <w:b/>
+                <w:bCs/>
+                <w:sz w:val="26"/>
+                <w:szCs w:val="26"/>
+              </w:rPr>
+              <w:t xml:space="preserve">Stock</w:t>
+            </w:r>
+            <w:r>
+              <w:rPr>
+                <w:rFonts w:ascii="Arial" w:cs="Arial" w:eastAsia="Arial" w:hAnsi="Arial"/>
+                <w:sz w:val="26"/>
+                <w:szCs w:val="26"/>
+              </w:rPr>
+              <w:t xml:space="preserve"> sheet.</w:t>
+            </w:r>
+          </w:p>
+          <w:p>
+            <w:pPr>
+              <w:spacing w:after="70"/>
+            </w:pPr>
+            <w:r>
+              <w:rPr>
+                <w:rFonts w:ascii="Arial" w:cs="Arial" w:eastAsia="Arial" w:hAnsi="Arial"/>
+                <w:b/>
+                <w:bCs/>
+                <w:color w:val="404040"/>
+                <w:sz w:val="26"/>
+                <w:szCs w:val="26"/>
+              </w:rPr>
+              <w:t xml:space="preserve">2.  </w:t>
+            </w:r>
+            <w:r>
+              <w:rPr>
+                <w:rFonts w:ascii="Arial" w:cs="Arial" w:eastAsia="Arial" w:hAnsi="Arial"/>
+                <w:sz w:val="26"/>
+                <w:szCs w:val="26"/>
+              </w:rPr>
+              <w:t xml:space="preserve">Type over the name in the </w:t>
+            </w:r>
+            <w:r>
+              <w:rPr>
+                <w:rFonts w:ascii="Arial" w:cs="Arial" w:eastAsia="Arial" w:hAnsi="Arial"/>
+                <w:b/>
+                <w:bCs/>
+                <w:sz w:val="26"/>
+                <w:szCs w:val="26"/>
+              </w:rPr>
+              <w:t xml:space="preserve">pink box</w:t>
+            </w:r>
+            <w:r>
+              <w:rPr>
+                <w:rFonts w:ascii="Arial" w:cs="Arial" w:eastAsia="Arial" w:hAnsi="Arial"/>
+                <w:sz w:val="26"/>
+                <w:szCs w:val="26"/>
+              </w:rPr>
+              <w:t xml:space="preserve"> on the right.</w:t>
+            </w:r>
+          </w:p>
+          <w:p>
+            <w:pPr>
+              <w:spacing w:after="70"/>
+            </w:pPr>
+            <w:r>
+              <w:rPr>
+                <w:rFonts w:ascii="Arial" w:cs="Arial" w:eastAsia="Arial" w:hAnsi="Arial"/>
+                <w:b/>
+                <w:bCs/>
+                <w:color w:val="404040"/>
+                <w:sz w:val="26"/>
+                <w:szCs w:val="26"/>
+              </w:rPr>
+              <w:t xml:space="preserve">3.  </w:t>
+            </w:r>
+            <w:r>
+              <w:rPr>
+                <w:rFonts w:ascii="Arial" w:cs="Arial" w:eastAsia="Arial" w:hAnsi="Arial"/>
+                <w:sz w:val="26"/>
+                <w:szCs w:val="26"/>
+              </w:rPr>
+              <w:t xml:space="preserve">The Map changes by itself.</w:t>
+            </w:r>
+          </w:p>
+        </w:tc>
+      </w:tr>
+    </w:tbl>
+    <w:p>
+      <w:pPr>
+        <w:spacing w:after="90"/>
+      </w:pPr>
+    </w:p>
+    <w:tbl>
+      <w:tblPr>
+        <w:tblW w:type="dxa" w:w="9638"/>
+        <w:tblBorders>
+          <w:top w:val="single" w:color="auto" w:sz="4"/>
+          <w:left w:val="single" w:color="auto" w:sz="4"/>
+          <w:bottom w:val="single" w:color="auto" w:sz="4"/>
+          <w:right w:val="single" w:color="auto" w:sz="4"/>
+          <w:insideH w:val="single" w:color="auto" w:sz="4"/>
+          <w:insideV w:val="single" w:color="auto" w:sz="4"/>
+        </w:tblBorders>
+      </w:tblPr>
+      <w:tblGrid>
+        <w:gridCol w:w="9638"/>
+      </w:tblGrid>
+      <w:tr>
+        <w:tc>
+          <w:tcPr>
+            <w:tcW w:type="dxa" w:w="9638"/>
+            <w:tcBorders>
+              <w:top w:val="none" w:color="FFFFFF" w:sz="0"/>
+              <w:left w:val="single" w:color="000000" w:sz="48"/>
+              <w:bottom w:val="none" w:color="FFFFFF" w:sz="0"/>
+              <w:right w:val="none" w:color="FFFFFF" w:sz="0"/>
+            </w:tcBorders>
+            <w:shd w:fill="F5F5F5" w:color="auto" w:val="clear"/>
+            <w:tcMar>
+              <w:top w:type="dxa" w:w="100"/>
+              <w:left w:type="dxa" w:w="260"/>
+              <w:bottom w:type="dxa" w:w="80"/>
+              <w:right w:type="dxa" w:w="200"/>
+            </w:tcMar>
+          </w:tcPr>
+          <w:p>
+            <w:pPr>
+              <w:spacing w:after="100"/>
+            </w:pPr>
+            <w:r>
+              <w:rPr>
+                <w:rFonts w:ascii="Arial" w:cs="Arial" w:eastAsia="Arial" w:hAnsi="Arial"/>
+                <w:b/>
+                <w:bCs/>
+                <w:color w:val="000000"/>
+                <w:sz w:val="32"/>
+                <w:szCs w:val="32"/>
+              </w:rPr>
+              <w:t xml:space="preserve">TURN ON THE MACROS (ONCE)</w:t>
+            </w:r>
+          </w:p>
+          <w:p>
+            <w:pPr>
+              <w:spacing w:after="70"/>
+            </w:pPr>
+            <w:r>
+              <w:rPr>
+                <w:rFonts w:ascii="Arial" w:cs="Arial" w:eastAsia="Arial" w:hAnsi="Arial"/>
+                <w:b/>
+                <w:bCs/>
+                <w:color w:val="000000"/>
+                <w:sz w:val="26"/>
+                <w:szCs w:val="26"/>
+              </w:rPr>
+              <w:t xml:space="preserve">1.  </w:t>
+            </w:r>
+            <w:r>
+              <w:rPr>
+                <w:rFonts w:ascii="Arial" w:cs="Arial" w:eastAsia="Arial" w:hAnsi="Arial"/>
+                <w:sz w:val="26"/>
+                <w:szCs w:val="26"/>
+              </w:rPr>
+              <w:t xml:space="preserve">Open </w:t>
+            </w:r>
+            <w:r>
+              <w:rPr>
+                <w:rFonts w:ascii="Arial" w:cs="Arial" w:eastAsia="Arial" w:hAnsi="Arial"/>
+                <w:b/>
+                <w:bCs/>
+                <w:sz w:val="26"/>
+                <w:szCs w:val="26"/>
+              </w:rPr>
+              <w:t xml:space="preserve">Floor_Map_Simple.xlsx</w:t>
+            </w:r>
+            <w:r>
+              <w:rPr>
+                <w:rFonts w:ascii="Arial" w:cs="Arial" w:eastAsia="Arial" w:hAnsi="Arial"/>
+                <w:sz w:val="26"/>
+                <w:szCs w:val="26"/>
+              </w:rPr>
+              <w:t xml:space="preserve">. Click </w:t>
+            </w:r>
+            <w:r>
+              <w:rPr>
+                <w:rFonts w:ascii="Arial" w:cs="Arial" w:eastAsia="Arial" w:hAnsi="Arial"/>
+                <w:b/>
+                <w:bCs/>
+                <w:sz w:val="26"/>
+                <w:szCs w:val="26"/>
+              </w:rPr>
+              <w:t xml:space="preserve">File → Save As</w:t>
+            </w:r>
+            <w:r>
+              <w:rPr>
+                <w:rFonts w:ascii="Arial" w:cs="Arial" w:eastAsia="Arial" w:hAnsi="Arial"/>
+                <w:sz w:val="26"/>
+                <w:szCs w:val="26"/>
+              </w:rPr>
+              <w:t xml:space="preserve"> and choose </w:t>
+            </w:r>
+            <w:r>
+              <w:rPr>
+                <w:rFonts w:ascii="Arial" w:cs="Arial" w:eastAsia="Arial" w:hAnsi="Arial"/>
+                <w:b/>
+                <w:bCs/>
+                <w:sz w:val="26"/>
+                <w:szCs w:val="26"/>
+              </w:rPr>
+              <w:t xml:space="preserve">Excel Macro-Enabled Workbook (.xlsm)</w:t>
+            </w:r>
+            <w:r>
+              <w:rPr>
+                <w:rFonts w:ascii="Arial" w:cs="Arial" w:eastAsia="Arial" w:hAnsi="Arial"/>
+                <w:sz w:val="26"/>
+                <w:szCs w:val="26"/>
+              </w:rPr>
+              <w:t xml:space="preserve">. Use the .xlsm from now on.</w:t>
+            </w:r>
+          </w:p>
+          <w:p>
+            <w:pPr>
+              <w:spacing w:after="70"/>
+            </w:pPr>
+            <w:r>
+              <w:rPr>
+                <w:rFonts w:ascii="Arial" w:cs="Arial" w:eastAsia="Arial" w:hAnsi="Arial"/>
+                <w:b/>
+                <w:bCs/>
+                <w:color w:val="000000"/>
+                <w:sz w:val="26"/>
+                <w:szCs w:val="26"/>
+              </w:rPr>
+              <w:t xml:space="preserve">2.  </w:t>
+            </w:r>
+            <w:r>
+              <w:rPr>
+                <w:rFonts w:ascii="Arial" w:cs="Arial" w:eastAsia="Arial" w:hAnsi="Arial"/>
+                <w:sz w:val="26"/>
+                <w:szCs w:val="26"/>
+              </w:rPr>
+              <w:t xml:space="preserve">Press </w:t>
+            </w:r>
+            <w:r>
+              <w:rPr>
+                <w:rFonts w:ascii="Arial" w:cs="Arial" w:eastAsia="Arial" w:hAnsi="Arial"/>
+                <w:b/>
+                <w:bCs/>
+                <w:sz w:val="26"/>
+                <w:szCs w:val="26"/>
+              </w:rPr>
+              <w:t xml:space="preserve">Alt + F11</w:t>
+            </w:r>
+            <w:r>
+              <w:rPr>
+                <w:rFonts w:ascii="Arial" w:cs="Arial" w:eastAsia="Arial" w:hAnsi="Arial"/>
+                <w:sz w:val="26"/>
+                <w:szCs w:val="26"/>
+              </w:rPr>
+              <w:t xml:space="preserve">. On the left, double-click the sheet that says </w:t>
+            </w:r>
+            <w:r>
+              <w:rPr>
+                <w:rFonts w:ascii="Arial" w:cs="Arial" w:eastAsia="Arial" w:hAnsi="Arial"/>
+                <w:b/>
+                <w:bCs/>
+                <w:sz w:val="26"/>
+                <w:szCs w:val="26"/>
+              </w:rPr>
+              <w:t xml:space="preserve">(Map)</w:t>
+            </w:r>
+            <w:r>
+              <w:rPr>
+                <w:rFonts w:ascii="Arial" w:cs="Arial" w:eastAsia="Arial" w:hAnsi="Arial"/>
+                <w:sz w:val="26"/>
+                <w:szCs w:val="26"/>
+              </w:rPr>
+              <w:t xml:space="preserve">.</w:t>
+            </w:r>
+          </w:p>
+          <w:p>
+            <w:pPr>
+              <w:spacing w:after="70"/>
+            </w:pPr>
+            <w:r>
+              <w:rPr>
+                <w:rFonts w:ascii="Arial" w:cs="Arial" w:eastAsia="Arial" w:hAnsi="Arial"/>
+                <w:b/>
+                <w:bCs/>
+                <w:color w:val="000000"/>
+                <w:sz w:val="26"/>
+                <w:szCs w:val="26"/>
+              </w:rPr>
+              <w:t xml:space="preserve">3.  </w:t>
+            </w:r>
+            <w:r>
+              <w:rPr>
+                <w:rFonts w:ascii="Arial" w:cs="Arial" w:eastAsia="Arial" w:hAnsi="Arial"/>
+                <w:sz w:val="26"/>
+                <w:szCs w:val="26"/>
+              </w:rPr>
+              <w:t xml:space="preserve">Open </w:t>
+            </w:r>
+            <w:r>
+              <w:rPr>
+                <w:rFonts w:ascii="Arial" w:cs="Arial" w:eastAsia="Arial" w:hAnsi="Arial"/>
+                <w:b/>
+                <w:bCs/>
+                <w:sz w:val="26"/>
+                <w:szCs w:val="26"/>
+              </w:rPr>
+              <w:t xml:space="preserve">Floor_Map_Simple_VBA.txt</w:t>
+            </w:r>
+            <w:r>
+              <w:rPr>
+                <w:rFonts w:ascii="Arial" w:cs="Arial" w:eastAsia="Arial" w:hAnsi="Arial"/>
+                <w:sz w:val="26"/>
+                <w:szCs w:val="26"/>
+              </w:rPr>
+              <w:t xml:space="preserve">. Copy everything </w:t>
+            </w:r>
+            <w:r>
+              <w:rPr>
+                <w:rFonts w:ascii="Arial" w:cs="Arial" w:eastAsia="Arial" w:hAnsi="Arial"/>
+                <w:b/>
+                <w:bCs/>
+                <w:sz w:val="26"/>
+                <w:szCs w:val="26"/>
+              </w:rPr>
+              <w:t xml:space="preserve">below the line of stars</w:t>
+            </w:r>
+            <w:r>
+              <w:rPr>
+                <w:rFonts w:ascii="Arial" w:cs="Arial" w:eastAsia="Arial" w:hAnsi="Arial"/>
+                <w:sz w:val="26"/>
+                <w:szCs w:val="26"/>
+              </w:rPr>
+              <w:t xml:space="preserve"> and paste it in.</w:t>
+            </w:r>
+          </w:p>
+          <w:p>
+            <w:pPr>
+              <w:spacing w:after="70"/>
+            </w:pPr>
+            <w:r>
+              <w:rPr>
+                <w:rFonts w:ascii="Arial" w:cs="Arial" w:eastAsia="Arial" w:hAnsi="Arial"/>
+                <w:b/>
+                <w:bCs/>
+                <w:color w:val="000000"/>
+                <w:sz w:val="26"/>
+                <w:szCs w:val="26"/>
+              </w:rPr>
+              <w:t xml:space="preserve">4.  </w:t>
+            </w:r>
+            <w:r>
+              <w:rPr>
+                <w:rFonts w:ascii="Arial" w:cs="Arial" w:eastAsia="Arial" w:hAnsi="Arial"/>
+                <w:sz w:val="26"/>
+                <w:szCs w:val="26"/>
+              </w:rPr>
+              <w:t xml:space="preserve">Close that window. Click any square on the Map. The </w:t>
+            </w:r>
+            <w:r>
+              <w:rPr>
+                <w:rFonts w:ascii="Arial" w:cs="Arial" w:eastAsia="Arial" w:hAnsi="Arial"/>
+                <w:b/>
+                <w:bCs/>
+                <w:sz w:val="26"/>
+                <w:szCs w:val="26"/>
+              </w:rPr>
+              <w:t xml:space="preserve">buttons</w:t>
+            </w:r>
+            <w:r>
+              <w:rPr>
+                <w:rFonts w:ascii="Arial" w:cs="Arial" w:eastAsia="Arial" w:hAnsi="Arial"/>
+                <w:sz w:val="26"/>
+                <w:szCs w:val="26"/>
+              </w:rPr>
+              <w:t xml:space="preserve"> appear.</w:t>
+            </w:r>
+          </w:p>
+          <w:p>
+            <w:pPr>
+              <w:spacing w:after="70"/>
+            </w:pPr>
+            <w:r>
+              <w:rPr>
+                <w:rFonts w:ascii="Arial" w:cs="Arial" w:eastAsia="Arial" w:hAnsi="Arial"/>
+                <w:b/>
+                <w:bCs/>
+                <w:color w:val="000000"/>
+                <w:sz w:val="26"/>
+                <w:szCs w:val="26"/>
+              </w:rPr>
+              <w:t xml:space="preserve">5.  </w:t>
+            </w:r>
+            <w:r>
+              <w:rPr>
+                <w:rFonts w:ascii="Arial" w:cs="Arial" w:eastAsia="Arial" w:hAnsi="Arial"/>
+                <w:sz w:val="26"/>
+                <w:szCs w:val="26"/>
+              </w:rPr>
+              <w:t xml:space="preserve">Press </w:t>
+            </w:r>
+            <w:r>
+              <w:rPr>
+                <w:rFonts w:ascii="Arial" w:cs="Arial" w:eastAsia="Arial" w:hAnsi="Arial"/>
+                <w:b/>
+                <w:bCs/>
+                <w:sz w:val="26"/>
+                <w:szCs w:val="26"/>
+              </w:rPr>
+              <w:t xml:space="preserve">Ctrl + S</w:t>
+            </w:r>
+            <w:r>
+              <w:rPr>
+                <w:rFonts w:ascii="Arial" w:cs="Arial" w:eastAsia="Arial" w:hAnsi="Arial"/>
+                <w:sz w:val="26"/>
+                <w:szCs w:val="26"/>
+              </w:rPr>
+              <w:t xml:space="preserve">. Next time, click </w:t>
+            </w:r>
+            <w:r>
+              <w:rPr>
+                <w:rFonts w:ascii="Arial" w:cs="Arial" w:eastAsia="Arial" w:hAnsi="Arial"/>
+                <w:b/>
+                <w:bCs/>
+                <w:sz w:val="26"/>
+                <w:szCs w:val="26"/>
+              </w:rPr>
+              <w:t xml:space="preserve">Enable Content</w:t>
+            </w:r>
+            <w:r>
+              <w:rPr>
+                <w:rFonts w:ascii="Arial" w:cs="Arial" w:eastAsia="Arial" w:hAnsi="Arial"/>
+                <w:sz w:val="26"/>
+                <w:szCs w:val="26"/>
+              </w:rPr>
+              <w:t xml:space="preserve"> if Excel asks.</w:t>
+            </w:r>
+          </w:p>
+        </w:tc>
+      </w:tr>
+    </w:tbl>
+    <w:p>
+      <w:pPr>
+        <w:spacing w:after="160"/>
+      </w:pPr>
+    </w:p>
+    <w:p>
+      <w:pPr>
+        <w:spacing w:after="80"/>
+      </w:pPr>
+      <w:r>
+        <w:rPr>
+          <w:rFonts w:ascii="Arial" w:cs="Arial" w:eastAsia="Arial" w:hAnsi="Arial"/>
+          <w:sz w:val="24"/>
+          <w:szCs w:val="24"/>
+        </w:rPr>
+        <w:t xml:space="preserve">Every change is saved on the </w:t>
+      </w:r>
+      <w:r>
+        <w:rPr>
+          <w:rFonts w:ascii="Arial" w:cs="Arial" w:eastAsia="Arial" w:hAnsi="Arial"/>
+          <w:b/>
+          <w:bCs/>
+          <w:sz w:val="24"/>
+          <w:szCs w:val="24"/>
+        </w:rPr>
+        <w:t xml:space="preserve">Moves</w:t>
+      </w:r>
+      <w:r>
+        <w:rPr>
+          <w:rFonts w:ascii="Arial" w:cs="Arial" w:eastAsia="Arial" w:hAnsi="Arial"/>
+          <w:sz w:val="24"/>
+          <w:szCs w:val="24"/>
+        </w:rPr>
+        <w:t xml:space="preserve"> sheet: when, who, what, from and to.</w:t>
       </w:r>
     </w:p>
     <w:sectPr>

</xml_diff>

<commit_message>
Simple map: editable Layout sheet + Rebuild map macro
New Layout sheet (tblLayout) holds each aisle's side, order, rows,
pallets deep, zone and use. The Rebuild map button redraws the Map,
legend, Stock zone counts and the hidden Squares list from it, keeping
pallets by square name and logging any that no longer fit.

Co-Authored-By: Claude Opus 5.5 <noreply@anthropic.com>
Claude-Session: https://claude.ai/code/session_01PaVB5ZWiX4HH2k96Bt3cJ6
</commit_message>
<xml_diff>
--- a/Floor_Map_Simple_Guide.docx
+++ b/Floor_Map_Simple_Guide.docx
@@ -873,6 +873,71 @@
                 <w:szCs w:val="24"/>
               </w:rPr>
               <w:t xml:space="preserve">Removes the pink borders and cancels a move.</w:t>
+            </w:r>
+          </w:p>
+        </w:tc>
+      </w:tr>
+      <w:tr>
+        <w:tc>
+          <w:tcPr>
+            <w:tcW w:type="dxa" w:w="2200"/>
+            <w:tcBorders>
+              <w:top w:val="single" w:color="FFFFFF" w:sz="24"/>
+              <w:left w:val="none" w:color="FFFFFF" w:sz="0"/>
+              <w:bottom w:val="single" w:color="FFFFFF" w:sz="24"/>
+              <w:right w:val="none" w:color="FFFFFF" w:sz="0"/>
+            </w:tcBorders>
+            <w:shd w:fill="0070C0" w:color="auto" w:val="clear"/>
+            <w:tcMar>
+              <w:top w:type="dxa" w:w="60"/>
+              <w:bottom w:type="dxa" w:w="60"/>
+            </w:tcMar>
+            <w:vAlign w:val="center"/>
+          </w:tcPr>
+          <w:p>
+            <w:pPr>
+              <w:jc w:val="center"/>
+            </w:pPr>
+            <w:r>
+              <w:rPr>
+                <w:rFonts w:ascii="Arial" w:cs="Arial" w:eastAsia="Arial" w:hAnsi="Arial"/>
+                <w:b/>
+                <w:bCs/>
+                <w:color w:val="FFFFFF"/>
+                <w:sz w:val="24"/>
+                <w:szCs w:val="24"/>
+              </w:rPr>
+              <w:t xml:space="preserve">Rebuild map</w:t>
+            </w:r>
+          </w:p>
+        </w:tc>
+        <w:tc>
+          <w:tcPr>
+            <w:tcW w:type="dxa" w:w="7438"/>
+            <w:tcBorders>
+              <w:top w:val="none" w:color="FFFFFF" w:sz="0"/>
+              <w:left w:val="none" w:color="FFFFFF" w:sz="0"/>
+              <w:bottom w:val="none" w:color="FFFFFF" w:sz="0"/>
+              <w:right w:val="none" w:color="FFFFFF" w:sz="0"/>
+            </w:tcBorders>
+            <w:tcMar>
+              <w:top w:type="dxa" w:w="60"/>
+              <w:left w:type="dxa" w:w="200"/>
+              <w:bottom w:type="dxa" w:w="60"/>
+            </w:tcMar>
+            <w:vAlign w:val="center"/>
+          </w:tcPr>
+          <w:p>
+            <w:pPr>
+              <w:spacing w:after="0"/>
+            </w:pPr>
+            <w:r>
+              <w:rPr>
+                <w:rFonts w:ascii="Arial" w:cs="Arial" w:eastAsia="Arial" w:hAnsi="Arial"/>
+                <w:sz w:val="24"/>
+                <w:szCs w:val="24"/>
+              </w:rPr>
+              <w:t xml:space="preserve">Redraws the map after you change the Layout sheet.</w:t>
             </w:r>
           </w:p>
         </w:tc>
@@ -1662,7 +1727,7 @@
             <w:tcW w:type="dxa" w:w="9638"/>
             <w:tcBorders>
               <w:top w:val="none" w:color="FFFFFF" w:sz="0"/>
-              <w:left w:val="single" w:color="000000" w:sz="48"/>
+              <w:left w:val="single" w:color="0070C0" w:sz="48"/>
               <w:bottom w:val="none" w:color="FFFFFF" w:sz="0"/>
               <w:right w:val="none" w:color="FFFFFF" w:sz="0"/>
             </w:tcBorders>
@@ -1683,6 +1748,207 @@
                 <w:rFonts w:ascii="Arial" w:cs="Arial" w:eastAsia="Arial" w:hAnsi="Arial"/>
                 <w:b/>
                 <w:bCs/>
+                <w:color w:val="0070C0"/>
+                <w:sz w:val="32"/>
+                <w:szCs w:val="32"/>
+              </w:rPr>
+              <w:t xml:space="preserve">CHANGE AISLE SIZES OR ADD AN AISLE?</w:t>
+            </w:r>
+          </w:p>
+          <w:p>
+            <w:pPr>
+              <w:spacing w:after="70"/>
+            </w:pPr>
+            <w:r>
+              <w:rPr>
+                <w:rFonts w:ascii="Arial" w:cs="Arial" w:eastAsia="Arial" w:hAnsi="Arial"/>
+                <w:b/>
+                <w:bCs/>
+                <w:color w:val="0070C0"/>
+                <w:sz w:val="26"/>
+                <w:szCs w:val="26"/>
+              </w:rPr>
+              <w:t xml:space="preserve">1.  </w:t>
+            </w:r>
+            <w:r>
+              <w:rPr>
+                <w:rFonts w:ascii="Arial" w:cs="Arial" w:eastAsia="Arial" w:hAnsi="Arial"/>
+                <w:sz w:val="26"/>
+                <w:szCs w:val="26"/>
+              </w:rPr>
+              <w:t xml:space="preserve">Go to the </w:t>
+            </w:r>
+            <w:r>
+              <w:rPr>
+                <w:rFonts w:ascii="Arial" w:cs="Arial" w:eastAsia="Arial" w:hAnsi="Arial"/>
+                <w:b/>
+                <w:bCs/>
+                <w:sz w:val="26"/>
+                <w:szCs w:val="26"/>
+              </w:rPr>
+              <w:t xml:space="preserve">Layout</w:t>
+            </w:r>
+            <w:r>
+              <w:rPr>
+                <w:rFonts w:ascii="Arial" w:cs="Arial" w:eastAsia="Arial" w:hAnsi="Arial"/>
+                <w:sz w:val="26"/>
+                <w:szCs w:val="26"/>
+              </w:rPr>
+              <w:t xml:space="preserve"> sheet.</w:t>
+            </w:r>
+          </w:p>
+          <w:p>
+            <w:pPr>
+              <w:spacing w:after="70"/>
+            </w:pPr>
+            <w:r>
+              <w:rPr>
+                <w:rFonts w:ascii="Arial" w:cs="Arial" w:eastAsia="Arial" w:hAnsi="Arial"/>
+                <w:b/>
+                <w:bCs/>
+                <w:color w:val="0070C0"/>
+                <w:sz w:val="26"/>
+                <w:szCs w:val="26"/>
+              </w:rPr>
+              <w:t xml:space="preserve">2.  </w:t>
+            </w:r>
+            <w:r>
+              <w:rPr>
+                <w:rFonts w:ascii="Arial" w:cs="Arial" w:eastAsia="Arial" w:hAnsi="Arial"/>
+                <w:sz w:val="26"/>
+                <w:szCs w:val="26"/>
+              </w:rPr>
+              <w:t xml:space="preserve">Change </w:t>
+            </w:r>
+            <w:r>
+              <w:rPr>
+                <w:rFonts w:ascii="Arial" w:cs="Arial" w:eastAsia="Arial" w:hAnsi="Arial"/>
+                <w:b/>
+                <w:bCs/>
+                <w:sz w:val="26"/>
+                <w:szCs w:val="26"/>
+              </w:rPr>
+              <w:t xml:space="preserve">Rows</w:t>
+            </w:r>
+            <w:r>
+              <w:rPr>
+                <w:rFonts w:ascii="Arial" w:cs="Arial" w:eastAsia="Arial" w:hAnsi="Arial"/>
+                <w:sz w:val="26"/>
+                <w:szCs w:val="26"/>
+              </w:rPr>
+              <w:t xml:space="preserve"> (how many pallets wide) or </w:t>
+            </w:r>
+            <w:r>
+              <w:rPr>
+                <w:rFonts w:ascii="Arial" w:cs="Arial" w:eastAsia="Arial" w:hAnsi="Arial"/>
+                <w:b/>
+                <w:bCs/>
+                <w:sz w:val="26"/>
+                <w:szCs w:val="26"/>
+              </w:rPr>
+              <w:t xml:space="preserve">Pallets deep</w:t>
+            </w:r>
+            <w:r>
+              <w:rPr>
+                <w:rFonts w:ascii="Arial" w:cs="Arial" w:eastAsia="Arial" w:hAnsi="Arial"/>
+                <w:sz w:val="26"/>
+                <w:szCs w:val="26"/>
+              </w:rPr>
+              <w:t xml:space="preserve">. For a new aisle, type it on the first empty row.</w:t>
+            </w:r>
+          </w:p>
+          <w:p>
+            <w:pPr>
+              <w:spacing w:after="70"/>
+            </w:pPr>
+            <w:r>
+              <w:rPr>
+                <w:rFonts w:ascii="Arial" w:cs="Arial" w:eastAsia="Arial" w:hAnsi="Arial"/>
+                <w:b/>
+                <w:bCs/>
+                <w:color w:val="0070C0"/>
+                <w:sz w:val="26"/>
+                <w:szCs w:val="26"/>
+              </w:rPr>
+              <w:t xml:space="preserve">3.  </w:t>
+            </w:r>
+            <w:r>
+              <w:rPr>
+                <w:rFonts w:ascii="Arial" w:cs="Arial" w:eastAsia="Arial" w:hAnsi="Arial"/>
+                <w:sz w:val="26"/>
+                <w:szCs w:val="26"/>
+              </w:rPr>
+              <w:t xml:space="preserve">Press </w:t>
+            </w:r>
+            <w:r>
+              <w:rPr>
+                <w:rFonts w:ascii="Arial" w:cs="Arial" w:eastAsia="Arial" w:hAnsi="Arial"/>
+                <w:b/>
+                <w:bCs/>
+                <w:sz w:val="26"/>
+                <w:szCs w:val="26"/>
+              </w:rPr>
+              <w:t xml:space="preserve">Rebuild map</w:t>
+            </w:r>
+            <w:r>
+              <w:rPr>
+                <w:rFonts w:ascii="Arial" w:cs="Arial" w:eastAsia="Arial" w:hAnsi="Arial"/>
+                <w:sz w:val="26"/>
+                <w:szCs w:val="26"/>
+              </w:rPr>
+              <w:t xml:space="preserve">. Pallets already on the map stay where they are.</w:t>
+            </w:r>
+          </w:p>
+        </w:tc>
+      </w:tr>
+    </w:tbl>
+    <w:p>
+      <w:pPr>
+        <w:spacing w:after="90"/>
+      </w:pPr>
+    </w:p>
+    <w:tbl>
+      <w:tblPr>
+        <w:tblW w:type="dxa" w:w="9638"/>
+        <w:tblBorders>
+          <w:top w:val="single" w:color="auto" w:sz="4"/>
+          <w:left w:val="single" w:color="auto" w:sz="4"/>
+          <w:bottom w:val="single" w:color="auto" w:sz="4"/>
+          <w:right w:val="single" w:color="auto" w:sz="4"/>
+          <w:insideH w:val="single" w:color="auto" w:sz="4"/>
+          <w:insideV w:val="single" w:color="auto" w:sz="4"/>
+        </w:tblBorders>
+      </w:tblPr>
+      <w:tblGrid>
+        <w:gridCol w:w="9638"/>
+      </w:tblGrid>
+      <w:tr>
+        <w:tc>
+          <w:tcPr>
+            <w:tcW w:type="dxa" w:w="9638"/>
+            <w:tcBorders>
+              <w:top w:val="none" w:color="FFFFFF" w:sz="0"/>
+              <w:left w:val="single" w:color="000000" w:sz="48"/>
+              <w:bottom w:val="none" w:color="FFFFFF" w:sz="0"/>
+              <w:right w:val="none" w:color="FFFFFF" w:sz="0"/>
+            </w:tcBorders>
+            <w:shd w:fill="F5F5F5" w:color="auto" w:val="clear"/>
+            <w:tcMar>
+              <w:top w:type="dxa" w:w="100"/>
+              <w:left w:type="dxa" w:w="260"/>
+              <w:bottom w:type="dxa" w:w="80"/>
+              <w:right w:type="dxa" w:w="200"/>
+            </w:tcMar>
+          </w:tcPr>
+          <w:p>
+            <w:pPr>
+              <w:spacing w:after="100"/>
+            </w:pPr>
+            <w:r>
+              <w:rPr>
+                <w:rFonts w:ascii="Arial" w:cs="Arial" w:eastAsia="Arial" w:hAnsi="Arial"/>
+                <w:b/>
+                <w:bCs/>
                 <w:color w:val="000000"/>
                 <w:sz w:val="32"/>
                 <w:szCs w:val="32"/>
@@ -1885,7 +2151,43 @@
                 <w:sz w:val="26"/>
                 <w:szCs w:val="26"/>
               </w:rPr>
-              <w:t xml:space="preserve"> and paste it in.</w:t>
+              <w:t xml:space="preserve"> and paste it in. (Already pasted an older version? Click in the code, press </w:t>
+            </w:r>
+            <w:r>
+              <w:rPr>
+                <w:rFonts w:ascii="Arial" w:cs="Arial" w:eastAsia="Arial" w:hAnsi="Arial"/>
+                <w:b/>
+                <w:bCs/>
+                <w:sz w:val="26"/>
+                <w:szCs w:val="26"/>
+              </w:rPr>
+              <w:t xml:space="preserve">Ctrl + A</w:t>
+            </w:r>
+            <w:r>
+              <w:rPr>
+                <w:rFonts w:ascii="Arial" w:cs="Arial" w:eastAsia="Arial" w:hAnsi="Arial"/>
+                <w:sz w:val="26"/>
+                <w:szCs w:val="26"/>
+              </w:rPr>
+              <w:t xml:space="preserve"> then </w:t>
+            </w:r>
+            <w:r>
+              <w:rPr>
+                <w:rFonts w:ascii="Arial" w:cs="Arial" w:eastAsia="Arial" w:hAnsi="Arial"/>
+                <w:b/>
+                <w:bCs/>
+                <w:sz w:val="26"/>
+                <w:szCs w:val="26"/>
+              </w:rPr>
+              <w:t xml:space="preserve">Delete</w:t>
+            </w:r>
+            <w:r>
+              <w:rPr>
+                <w:rFonts w:ascii="Arial" w:cs="Arial" w:eastAsia="Arial" w:hAnsi="Arial"/>
+                <w:sz w:val="26"/>
+                <w:szCs w:val="26"/>
+              </w:rPr>
+              <w:t xml:space="preserve"> first.)</w:t>
             </w:r>
           </w:p>
           <w:p>

</xml_diff>